<commit_message>
Literature review is Done
</commit_message>
<xml_diff>
--- a/Proposal/Japan_At_Inflection_points.docx
+++ b/Proposal/Japan_At_Inflection_points.docx
@@ -5,7 +5,6 @@
     <w:p>
       <w:pPr>
         <w:pStyle w:val="Subtitle"/>
-        <w:bidi w:val="0"/>
         <w:spacing w:before="240"/>
         <w:rPr>
           <w:rFonts w:asciiTheme="majorBidi" w:hAnsiTheme="majorBidi"/>
@@ -16,7 +15,13 @@
           <w:szCs w:val="56"/>
         </w:rPr>
       </w:pPr>
-      <w:r>
+      <w:bookmarkStart w:id="0" w:name="_top"/>
+      <w:bookmarkEnd w:id="0"/>
+    </w:p>
+    <w:p>
+      <w:pPr>
+        <w:pStyle w:val="Subtitle"/>
+        <w:spacing w:before="240"/>
         <w:rPr>
           <w:rFonts w:asciiTheme="majorBidi" w:hAnsiTheme="majorBidi"/>
           <w:color w:val="auto"/>
@@ -25,28 +30,50 @@
           <w:sz w:val="44"/>
           <w:szCs w:val="56"/>
         </w:rPr>
+      </w:pPr>
+    </w:p>
+    <w:p>
+      <w:pPr>
+        <w:pStyle w:val="Subtitle"/>
+        <w:spacing w:before="240"/>
+        <w:rPr>
+          <w:rFonts w:asciiTheme="majorBidi" w:hAnsiTheme="majorBidi"/>
+          <w:color w:val="auto"/>
+          <w:spacing w:val="-10"/>
+          <w:kern w:val="28"/>
+          <w:sz w:val="44"/>
+          <w:szCs w:val="56"/>
+        </w:rPr>
+      </w:pPr>
+      <w:r>
+        <w:rPr>
+          <w:rFonts w:asciiTheme="majorBidi" w:hAnsiTheme="majorBidi"/>
+          <w:color w:val="auto"/>
+          <w:spacing w:val="-10"/>
+          <w:kern w:val="28"/>
+          <w:sz w:val="44"/>
+          <w:szCs w:val="56"/>
+        </w:rPr>
         <w:t>"Strategic Adaptation and Policy Synergies: Business Leadership at Japan's Post-War Economic Inflection Points"</w:t>
       </w:r>
     </w:p>
     <w:p>
       <w:pPr>
-        <w:bidi w:val="0"/>
-      </w:pPr>
-    </w:p>
-    <w:p>
-      <w:pPr>
         <w:pStyle w:val="Subtitle"/>
-        <w:bidi w:val="0"/>
         <w:spacing w:before="240"/>
         <w:rPr>
           <w:i/>
           <w:iCs/>
+          <w:sz w:val="24"/>
+          <w:szCs w:val="24"/>
         </w:rPr>
       </w:pPr>
       <w:r>
         <w:rPr>
           <w:i/>
           <w:iCs/>
+          <w:sz w:val="24"/>
+          <w:szCs w:val="24"/>
         </w:rPr>
         <w:t>By R</w:t>
       </w:r>
@@ -54,46 +81,41 @@
         <w:rPr>
           <w:i/>
           <w:iCs/>
+          <w:sz w:val="24"/>
+          <w:szCs w:val="24"/>
         </w:rPr>
         <w:t>eza Fayazi</w:t>
       </w:r>
     </w:p>
-    <w:p>
-      <w:pPr>
-        <w:bidi w:val="0"/>
-      </w:pPr>
-    </w:p>
-    <w:p>
-      <w:pPr>
-        <w:bidi w:val="0"/>
-      </w:pPr>
-    </w:p>
-    <w:p>
-      <w:pPr>
-        <w:bidi w:val="0"/>
-      </w:pPr>
-    </w:p>
-    <w:p>
-      <w:pPr>
-        <w:bidi w:val="0"/>
+    <w:p/>
+    <w:p/>
+    <w:p/>
+    <w:p>
+      <w:pPr>
         <w:ind w:left="288" w:firstLine="0"/>
       </w:pPr>
     </w:p>
     <w:p>
       <w:pPr>
         <w:pStyle w:val="Title2"/>
+      </w:pPr>
+      <w:bookmarkStart w:id="1" w:name="_Toc234761688"/>
+      <w:r>
+        <w:t>Abst</w:t>
+      </w:r>
+      <w:r>
+        <w:t>r</w:t>
+      </w:r>
+      <w:r>
+        <w:t>act</w:t>
+      </w:r>
+      <w:bookmarkEnd w:id="1"/>
+    </w:p>
+    <w:p>
+      <w:pPr>
         <w:ind w:left="288" w:firstLine="0"/>
       </w:pPr>
       <w:r>
-        <w:t>Abstract</w:t>
-      </w:r>
-    </w:p>
-    <w:p>
-      <w:pPr>
-        <w:bidi w:val="0"/>
-        <w:ind w:left="288" w:firstLine="0"/>
-      </w:pPr>
-      <w:r>
         <w:t xml:space="preserve">This is a concise study about Japan’s economy throughout years 1945 to 2011. In this paper we analyze how did we </w:t>
       </w:r>
     </w:p>
@@ -105,119 +127,1084 @@
     <w:p>
       <w:pPr>
         <w:pStyle w:val="Quote"/>
-        <w:bidi w:val="0"/>
-      </w:pPr>
-    </w:p>
-    <w:p>
-      <w:pPr>
-        <w:bidi w:val="0"/>
-      </w:pPr>
-    </w:p>
-    <w:p>
-      <w:pPr>
-        <w:bidi w:val="0"/>
-      </w:pPr>
-    </w:p>
-    <w:p>
-      <w:pPr>
-        <w:pStyle w:val="Title"/>
-        <w:bidi w:val="0"/>
-      </w:pPr>
-    </w:p>
-    <w:p>
-      <w:pPr>
-        <w:pStyle w:val="Subtitle"/>
-        <w:bidi w:val="0"/>
-      </w:pPr>
-    </w:p>
-    <w:p>
-      <w:pPr>
-        <w:bidi w:val="0"/>
-      </w:pPr>
-    </w:p>
-    <w:p>
-      <w:pPr>
-        <w:bidi w:val="0"/>
-      </w:pPr>
-    </w:p>
-    <w:p>
-      <w:pPr>
-        <w:bidi w:val="0"/>
-      </w:pPr>
-    </w:p>
-    <w:p>
-      <w:pPr>
-        <w:bidi w:val="0"/>
-      </w:pPr>
-    </w:p>
-    <w:p>
-      <w:pPr>
-        <w:bidi w:val="0"/>
-      </w:pPr>
-    </w:p>
-    <w:p>
-      <w:pPr>
-        <w:bidi w:val="0"/>
-      </w:pPr>
-    </w:p>
-    <w:p>
-      <w:pPr>
-        <w:bidi w:val="0"/>
-      </w:pPr>
-      <w:r>
+      </w:pPr>
+    </w:p>
+    <w:p/>
+    <w:p/>
+    <w:p/>
+    <w:p>
+      <w:pPr>
+        <w:ind w:firstLine="0"/>
+      </w:pPr>
+    </w:p>
+    <w:p>
+      <w:pPr>
+        <w:ind w:firstLine="0"/>
+      </w:pPr>
+    </w:p>
+    <w:p>
+      <w:pPr>
+        <w:ind w:firstLine="0"/>
+      </w:pPr>
+    </w:p>
+    <w:p>
+      <w:pPr>
+        <w:ind w:firstLine="0"/>
+      </w:pPr>
+    </w:p>
+    <w:p>
+      <w:pPr>
+        <w:rPr>
+          <w:rFonts w:asciiTheme="majorBidi" w:eastAsiaTheme="majorEastAsia" w:hAnsiTheme="majorBidi" w:cstheme="majorBidi"/>
+          <w:color w:val="auto"/>
+          <w:spacing w:val="-10"/>
+          <w:kern w:val="28"/>
+          <w:sz w:val="36"/>
+          <w:szCs w:val="56"/>
+        </w:rPr>
+      </w:pPr>
+      <w:r>
+        <w:rPr>
+          <w:rFonts w:asciiTheme="majorBidi" w:eastAsiaTheme="majorEastAsia" w:hAnsiTheme="majorBidi" w:cstheme="majorBidi"/>
+          <w:color w:val="auto"/>
+          <w:spacing w:val="-10"/>
+          <w:kern w:val="28"/>
+          <w:sz w:val="36"/>
+          <w:szCs w:val="56"/>
+        </w:rPr>
         <w:t>Keywords</w:t>
       </w:r>
-    </w:p>
-    <w:p>
-      <w:pPr>
-        <w:bidi w:val="0"/>
-      </w:pPr>
-      <w:r>
-        <w:t>Japanese Economic Miracle, Post-War Inflection Points, Keiretsu Networks, Business Leaders/Entrepreneurs, MITI</w:t>
+      <w:r>
+        <w:rPr>
+          <w:rFonts w:asciiTheme="majorBidi" w:eastAsiaTheme="majorEastAsia" w:hAnsiTheme="majorBidi" w:cstheme="majorBidi"/>
+          <w:color w:val="auto"/>
+          <w:spacing w:val="-10"/>
+          <w:kern w:val="28"/>
+          <w:sz w:val="36"/>
+          <w:szCs w:val="56"/>
+        </w:rPr>
+        <mc:AlternateContent>
+          <mc:Choice Requires="wps">
+            <w:drawing>
+              <wp:anchor distT="0" distB="0" distL="114300" distR="114300" simplePos="0" relativeHeight="251659264" behindDoc="1" locked="0" layoutInCell="1" allowOverlap="1" wp14:anchorId="6C9D1408" wp14:editId="32B443F8">
+                <wp:simplePos x="0" y="0"/>
+                <wp:positionH relativeFrom="margin">
+                  <wp:align>center</wp:align>
+                </wp:positionH>
+                <wp:positionV relativeFrom="paragraph">
+                  <wp:posOffset>372115</wp:posOffset>
+                </wp:positionV>
+                <wp:extent cx="5678170" cy="1828800"/>
+                <wp:effectExtent l="0" t="0" r="0" b="4445"/>
+                <wp:wrapTight wrapText="bothSides">
+                  <wp:wrapPolygon edited="0">
+                    <wp:start x="217" y="0"/>
+                    <wp:lineTo x="217" y="21184"/>
+                    <wp:lineTo x="21378" y="21184"/>
+                    <wp:lineTo x="21378" y="0"/>
+                    <wp:lineTo x="217" y="0"/>
+                  </wp:wrapPolygon>
+                </wp:wrapTight>
+                <wp:docPr id="1" name="Text Box 1"/>
+                <wp:cNvGraphicFramePr/>
+                <a:graphic xmlns:a="http://schemas.openxmlformats.org/drawingml/2006/main">
+                  <a:graphicData uri="http://schemas.microsoft.com/office/word/2010/wordprocessingShape">
+                    <wps:wsp>
+                      <wps:cNvSpPr txBox="1"/>
+                      <wps:spPr>
+                        <a:xfrm>
+                          <a:off x="0" y="0"/>
+                          <a:ext cx="5678170" cy="1828800"/>
+                        </a:xfrm>
+                        <a:prstGeom prst="rect">
+                          <a:avLst/>
+                        </a:prstGeom>
+                        <a:noFill/>
+                        <a:ln w="6350">
+                          <a:noFill/>
+                        </a:ln>
+                      </wps:spPr>
+                      <wps:txbx>
+                        <w:txbxContent>
+                          <w:p>
+                            <w:pPr>
+                              <w:jc w:val="both"/>
+                            </w:pPr>
+                            <w:r>
+                              <w:t>Japanese Economic Miracle, Post-War Inflection Points, Keiretsu Networks, Business Leaders/Entrepreneurs, MITI</w:t>
+                            </w:r>
+                            <w:r>
+                              <w:t xml:space="preserve">, </w:t>
+                            </w:r>
+                            <w:r>
+                              <w:t>METI, Corporate Adaptation, Strategic Decision-Making, Policy Synergies,</w:t>
+                            </w:r>
+                            <w:r>
+                              <w:t xml:space="preserve"> Policy-Business Nexus,</w:t>
+                            </w:r>
+                            <w:r>
+                              <w:t xml:space="preserve"> Economic Restructuring, Export-Led Growth, </w:t>
+                            </w:r>
+                            <w:r>
+                              <w:t>Bank of Japan</w:t>
+                            </w:r>
+                            <w:r>
+                              <w:t>.</w:t>
+                            </w:r>
+                          </w:p>
+                        </w:txbxContent>
+                      </wps:txbx>
+                      <wps:bodyPr rot="0" spcFirstLastPara="0" vertOverflow="overflow" horzOverflow="overflow" vert="horz" wrap="square" lIns="91440" tIns="45720" rIns="91440" bIns="45720" numCol="1" spcCol="0" rtlCol="0" fromWordArt="0" anchor="t" anchorCtr="0" forceAA="0" compatLnSpc="1">
+                        <a:prstTxWarp prst="textNoShape">
+                          <a:avLst/>
+                        </a:prstTxWarp>
+                        <a:spAutoFit/>
+                      </wps:bodyPr>
+                    </wps:wsp>
+                  </a:graphicData>
+                </a:graphic>
+                <wp14:sizeRelH relativeFrom="margin">
+                  <wp14:pctWidth>0</wp14:pctWidth>
+                </wp14:sizeRelH>
+              </wp:anchor>
+            </w:drawing>
+          </mc:Choice>
+          <mc:Fallback>
+            <w:pict>
+              <v:shapetype w14:anchorId="6C9D1408" id="_x0000_t202" coordsize="21600,21600" o:spt="202" path="m,l,21600r21600,l21600,xe">
+                <v:stroke joinstyle="miter"/>
+                <v:path gradientshapeok="t" o:connecttype="rect"/>
+              </v:shapetype>
+              <v:shape id="Text Box 1" o:spid="_x0000_s1026" type="#_x0000_t202" style="position:absolute;left:0;text-align:left;margin-left:0;margin-top:29.3pt;width:447.1pt;height:2in;z-index:-251657216;visibility:visible;mso-wrap-style:square;mso-width-percent:0;mso-wrap-distance-left:9pt;mso-wrap-distance-top:0;mso-wrap-distance-right:9pt;mso-wrap-distance-bottom:0;mso-position-horizontal:center;mso-position-horizontal-relative:margin;mso-position-vertical:absolute;mso-position-vertical-relative:text;mso-width-percent:0;mso-width-relative:margin;v-text-anchor:top" o:gfxdata="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" filled="f" stroked="f" strokeweight=".5pt">
+                <v:fill o:detectmouseclick="t"/>
+                <v:textbox style="mso-fit-shape-to-text:t">
+                  <w:txbxContent>
+                    <w:p>
+                      <w:pPr>
+                        <w:jc w:val="both"/>
+                      </w:pPr>
+                      <w:r>
+                        <w:t>Japanese Economic Miracle, Post-War Inflection Points, Keiretsu Networks, Business Leaders/Entrepreneurs, MITI</w:t>
+                      </w:r>
+                      <w:r>
+                        <w:t xml:space="preserve">, </w:t>
+                      </w:r>
+                      <w:r>
+                        <w:t>METI, Corporate Adaptation, Strategic Decision-Making, Policy Synergies,</w:t>
+                      </w:r>
+                      <w:r>
+                        <w:t xml:space="preserve"> Policy-Business Nexus,</w:t>
+                      </w:r>
+                      <w:r>
+                        <w:t xml:space="preserve"> Economic Restructuring, Export-Led Growth, </w:t>
+                      </w:r>
+                      <w:r>
+                        <w:t>Bank of Japan</w:t>
+                      </w:r>
+                      <w:r>
+                        <w:t>.</w:t>
+                      </w:r>
+                    </w:p>
+                  </w:txbxContent>
+                </v:textbox>
+                <w10:wrap type="tight" anchorx="margin"/>
+              </v:shape>
+            </w:pict>
+          </mc:Fallback>
+        </mc:AlternateContent>
+      </w:r>
+      <w:r>
+        <w:rPr>
+          <w:rFonts w:asciiTheme="majorBidi" w:eastAsiaTheme="majorEastAsia" w:hAnsiTheme="majorBidi" w:cstheme="majorBidi"/>
+          <w:color w:val="auto"/>
+          <w:spacing w:val="-10"/>
+          <w:kern w:val="28"/>
+          <w:sz w:val="36"/>
+          <w:szCs w:val="56"/>
+        </w:rPr>
+        <w:t>:</w:t>
+      </w:r>
+    </w:p>
+    <w:p>
+      <w:pPr>
+        <w:ind w:firstLine="0"/>
+      </w:pPr>
+    </w:p>
+    <w:sdt>
+      <w:sdtPr>
+        <w:id w:val="1780522794"/>
+        <w:docPartObj>
+          <w:docPartGallery w:val="Table of Contents"/>
+          <w:docPartUnique/>
+        </w:docPartObj>
+      </w:sdtPr>
+      <w:sdtEndPr>
+        <w:rPr>
+          <w:rFonts w:ascii="Times New Roman" w:eastAsiaTheme="minorHAnsi" w:hAnsi="Times New Roman" w:cstheme="minorBidi"/>
+          <w:b/>
+          <w:bCs/>
+          <w:noProof/>
+          <w:color w:val="262626" w:themeColor="text1" w:themeTint="D9"/>
+          <w:kern w:val="2"/>
+          <w:sz w:val="22"/>
+          <w:szCs w:val="24"/>
+          <w14:ligatures w14:val="standardContextual"/>
+        </w:rPr>
+      </w:sdtEndPr>
+      <w:sdtContent>
+        <w:p>
+          <w:pPr>
+            <w:pStyle w:val="TOCHeading"/>
+          </w:pPr>
+          <w:r>
+            <w:t>Contents</w:t>
+          </w:r>
+        </w:p>
+        <w:p>
+          <w:pPr>
+            <w:pStyle w:val="TOC1"/>
+            <w:tabs>
+              <w:tab w:val="right" w:leader="dot" w:pos="9736"/>
+            </w:tabs>
+            <w:rPr>
+              <w:rFonts w:cstheme="minorBidi"/>
+              <w:noProof/>
+              <w:kern w:val="2"/>
+              <w:sz w:val="24"/>
+              <w:szCs w:val="24"/>
+              <w14:ligatures w14:val="standardContextual"/>
+            </w:rPr>
+          </w:pPr>
+          <w:r>
+            <w:fldChar w:fldCharType="begin"/>
+          </w:r>
+          <w:r>
+            <w:instrText xml:space="preserve"> TOC \o "1-3" \h \z \u </w:instrText>
+          </w:r>
+          <w:r>
+            <w:fldChar w:fldCharType="separate"/>
+          </w:r>
+          <w:hyperlink w:anchor="_Toc234761688" w:history="1">
+            <w:r>
+              <w:rPr>
+                <w:rStyle w:val="Hyperlink"/>
+                <w:noProof/>
+              </w:rPr>
+              <w:t>Abstract</w:t>
+            </w:r>
+            <w:r>
+              <w:rPr>
+                <w:noProof/>
+                <w:webHidden/>
+              </w:rPr>
+              <w:tab/>
+            </w:r>
+            <w:r>
+              <w:rPr>
+                <w:noProof/>
+                <w:webHidden/>
+              </w:rPr>
+              <w:fldChar w:fldCharType="begin"/>
+            </w:r>
+            <w:r>
+              <w:rPr>
+                <w:noProof/>
+                <w:webHidden/>
+              </w:rPr>
+              <w:instrText xml:space="preserve"> PAGEREF _Toc234761688 \h </w:instrText>
+            </w:r>
+            <w:r>
+              <w:rPr>
+                <w:noProof/>
+                <w:webHidden/>
+              </w:rPr>
+            </w:r>
+            <w:r>
+              <w:rPr>
+                <w:noProof/>
+                <w:webHidden/>
+              </w:rPr>
+              <w:fldChar w:fldCharType="separate"/>
+            </w:r>
+            <w:r>
+              <w:rPr>
+                <w:noProof/>
+                <w:webHidden/>
+              </w:rPr>
+              <w:t>1</w:t>
+            </w:r>
+            <w:r>
+              <w:rPr>
+                <w:noProof/>
+                <w:webHidden/>
+              </w:rPr>
+              <w:fldChar w:fldCharType="end"/>
+            </w:r>
+          </w:hyperlink>
+        </w:p>
+        <w:p>
+          <w:pPr>
+            <w:pStyle w:val="TOC1"/>
+            <w:tabs>
+              <w:tab w:val="right" w:leader="dot" w:pos="9736"/>
+            </w:tabs>
+            <w:rPr>
+              <w:rFonts w:cstheme="minorBidi"/>
+              <w:noProof/>
+              <w:kern w:val="2"/>
+              <w:sz w:val="24"/>
+              <w:szCs w:val="24"/>
+              <w14:ligatures w14:val="standardContextual"/>
+            </w:rPr>
+          </w:pPr>
+          <w:hyperlink w:anchor="_Toc234761689" w:history="1">
+            <w:r>
+              <w:rPr>
+                <w:rStyle w:val="Hyperlink"/>
+                <w:noProof/>
+              </w:rPr>
+              <w:t>Literature Review</w:t>
+            </w:r>
+            <w:r>
+              <w:rPr>
+                <w:noProof/>
+                <w:webHidden/>
+              </w:rPr>
+              <w:tab/>
+            </w:r>
+            <w:r>
+              <w:rPr>
+                <w:noProof/>
+                <w:webHidden/>
+              </w:rPr>
+              <w:fldChar w:fldCharType="begin"/>
+            </w:r>
+            <w:r>
+              <w:rPr>
+                <w:noProof/>
+                <w:webHidden/>
+              </w:rPr>
+              <w:instrText xml:space="preserve"> PAGEREF _Toc234761689 \h </w:instrText>
+            </w:r>
+            <w:r>
+              <w:rPr>
+                <w:noProof/>
+                <w:webHidden/>
+              </w:rPr>
+            </w:r>
+            <w:r>
+              <w:rPr>
+                <w:noProof/>
+                <w:webHidden/>
+              </w:rPr>
+              <w:fldChar w:fldCharType="separate"/>
+            </w:r>
+            <w:r>
+              <w:rPr>
+                <w:noProof/>
+                <w:webHidden/>
+              </w:rPr>
+              <w:t>3</w:t>
+            </w:r>
+            <w:r>
+              <w:rPr>
+                <w:noProof/>
+                <w:webHidden/>
+              </w:rPr>
+              <w:fldChar w:fldCharType="end"/>
+            </w:r>
+          </w:hyperlink>
+        </w:p>
+        <w:p>
+          <w:r>
+            <w:rPr>
+              <w:b/>
+              <w:bCs/>
+              <w:noProof/>
+            </w:rPr>
+            <w:fldChar w:fldCharType="end"/>
+          </w:r>
+        </w:p>
+      </w:sdtContent>
+    </w:sdt>
+    <w:p>
+      <w:pPr>
+        <w:bidi/>
+      </w:pPr>
+      <w:r>
+        <w:rPr>
+          <w:rtl/>
+        </w:rPr>
+        <w:br w:type="page"/>
+      </w:r>
+    </w:p>
+    <w:p>
+      <w:pPr>
+        <w:bidi/>
+      </w:pPr>
+    </w:p>
+    <w:p>
+      <w:pPr>
+        <w:bidi/>
+      </w:pPr>
+    </w:p>
+    <w:p>
+      <w:pPr>
+        <w:bidi/>
+      </w:pPr>
+    </w:p>
+    <w:p>
+      <w:pPr>
+        <w:bidi/>
+      </w:pPr>
+    </w:p>
+    <w:p>
+      <w:pPr>
+        <w:bidi/>
+      </w:pPr>
+    </w:p>
+    <w:p>
+      <w:pPr>
+        <w:bidi/>
+      </w:pPr>
+    </w:p>
+    <w:p>
+      <w:pPr>
+        <w:bidi/>
+      </w:pPr>
+    </w:p>
+    <w:p>
+      <w:pPr>
+        <w:pStyle w:val="Title2"/>
+        <w:ind w:left="0"/>
+      </w:pPr>
+      <w:bookmarkStart w:id="2" w:name="_Toc234761689"/>
+      <w:r>
+        <w:t>Literature Review</w:t>
+      </w:r>
+      <w:bookmarkEnd w:id="2"/>
+    </w:p>
+    <w:p>
+      <w:pPr>
+        <w:jc w:val="both"/>
+      </w:pPr>
+    </w:p>
+    <w:p>
+      <w:pPr>
+        <w:jc w:val="both"/>
+      </w:pPr>
+    </w:p>
+    <w:p>
+      <w:pPr>
+        <w:jc w:val="both"/>
+        <w:rPr>
+          <w:rFonts w:cs="Arial"/>
+        </w:rPr>
+      </w:pPr>
+      <w:r>
+        <w:t>The postwar Japanese economic miracle (c. 1950–1973) exemplifies rapid industrialization driven by business adaptation, government policies, and institutional evolution. This review synthesizes three key works—</w:t>
+      </w:r>
+      <w:r>
+        <w:t xml:space="preserve"> </w:t>
+      </w:r>
+      <w:r>
+        <w:t>Addicott, David A. C. (2017)</w:t>
       </w:r>
       <w:r>
         <w:t xml:space="preserve">, </w:t>
       </w:r>
       <w:r>
-        <w:t>METI, Corporate Adaptation, Strategic Decision-Making, Policy Synergies,</w:t>
+        <w:t>Grabowiecki (2006), and Takada (1999)—focusing on business owners' actions at inflection points, supporting policies, and resulting economic outcomes. These papers collectively illuminate the transition from prewar zaibatsu conglomerates to postwar keiretsu networks, highlighting how relational governance and policy coordination fueled growth while revealing structural limitations. APA citations are used throughout</w:t>
+      </w:r>
+      <w:r>
+        <w:rPr>
+          <w:rFonts w:cs="Arial"/>
+          <w:rtl/>
+        </w:rPr>
+        <w:t>.</w:t>
+      </w:r>
+    </w:p>
+    <w:p>
+      <w:pPr>
+        <w:jc w:val="both"/>
+      </w:pPr>
+      <w:r>
+        <w:rPr>
+          <w:rFonts w:cs="Arial"/>
+        </w:rPr>
+        <w:t xml:space="preserve">Keiretsu was quite the start of the post-modern inter-firm networks that emerged after the postwar dissolution (and denazification) of a family-controlled conglomerates name Zaibatsu. They were clusters of independent companies linked by </w:t>
+      </w:r>
+      <w:r>
+        <w:rPr>
+          <w:rFonts w:cs="Arial"/>
+        </w:rPr>
+        <w:t>an economic institution which made them have a cross-shareholding policy</w:t>
       </w:r>
       <w:r>
         <w:t xml:space="preserve"> </w:t>
       </w:r>
       <w:r>
-        <w:t>Policy-Business Nexus</w:t>
+        <w:t>Grabowiecki (2006)</w:t>
+      </w:r>
+      <w:r>
+        <w:rPr>
+          <w:rFonts w:cs="Arial"/>
+        </w:rPr>
+        <w:t xml:space="preserve">. This kind of institution reshaped the competition in the business market of Japan and to some extent, it was a fine stepping stone for Japan’s Economy. The Keiretsu system fell into horizontal and vertical types. Business owners had high incentives to be a part of keiretsu due to stable capital, information flow, and coordinated investment. </w:t>
+      </w:r>
+    </w:p>
+    <w:p>
+      <w:pPr>
+        <w:jc w:val="both"/>
+      </w:pPr>
+      <w:r>
+        <w:t>Addicott, David A. C. (2017)</w:t>
+      </w:r>
+      <w:r>
+        <w:t xml:space="preserve"> </w:t>
+      </w:r>
+      <w:r>
+        <w:t>provides a historical overview of the zaibatsu's rise and dissolution, emphasizing their role in Japan's modernization and the policy-driven shifts that reshaped business strategies. Zaibatsu—family-controlled conglomerates like Mitsui, Mitsubishi, Sumitomo, and Yasuda—emerged during the Meiji Restoration (1868 onward) as vehicles for state-led industrialization. Business owners leveraged political connections ("political merchants") to secure monopolistic advantages in banking, trading, mining, and manufacturing. By the interwar period, these groups dominated the economy, financing military expansion and wartime production</w:t>
+      </w:r>
+      <w:r>
+        <w:rPr>
+          <w:rFonts w:cs="Arial"/>
+          <w:rtl/>
+        </w:rPr>
+        <w:t>.</w:t>
+      </w:r>
+    </w:p>
+    <w:p>
+      <w:pPr>
+        <w:jc w:val="both"/>
+      </w:pPr>
+      <w:r>
+        <w:t xml:space="preserve">SCAP occupation policies (1945–1952) marked a critical inflection point. Antitrust reforms mandated zaibatsu dissolution to democratize the economy and prevent militarism's recurrence. Holding companies were banned, family assets liquidated, and cross-holdings dismantled. Addicott details how these policies forced business leaders to adapt: former affiliates reorganized into looser, bank-centered </w:t>
+      </w:r>
+      <w:r>
+        <w:t>keiretsu</w:t>
+      </w:r>
+      <w:r>
+        <w:t>. This transition preserved core competencies in relational contracting while introducing greater competition. Policies such as land reform and labor democratization complemented these changes, creating a skilled workforce and broader domestic market</w:t>
+      </w:r>
+      <w:r>
+        <w:rPr>
+          <w:rFonts w:cs="Arial"/>
+          <w:rtl/>
+        </w:rPr>
+        <w:t>.</w:t>
+      </w:r>
+    </w:p>
+    <w:p>
+      <w:pPr>
+        <w:jc w:val="both"/>
+        <w:rPr>
+          <w:rFonts w:cs="Arial"/>
+        </w:rPr>
+      </w:pPr>
+      <w:r>
+        <w:lastRenderedPageBreak/>
+        <w:t>Outcomes were largely positive in the short term. Freed from family control, professional managers pursued aggressive investment and technology adoption, supported by MITI</w:t>
+      </w:r>
+      <w:r>
+        <w:t xml:space="preserve"> (</w:t>
+      </w:r>
+      <w:r>
+        <w:t>Ministry of International Trade and Industry, 1949–2001; later METI</w:t>
+      </w:r>
+      <w:r>
+        <w:t>)</w:t>
+      </w:r>
+      <w:r>
+        <w:t xml:space="preserve"> guidance and Bank of Japan financing. Addicott argues this restructuring laid the foundation for export-led growth, with keiretsu enabling risk-sharing and long-term planning. However, incomplete dissolution allowed informal networks to persist, contributing to the "Japanese model" of coordinated capitalism. Criticisms in the literature (echoed by Addicott) note that reforms inadvertently concentrated power in banks, </w:t>
+      </w:r>
+      <w:r>
+        <w:t xml:space="preserve">which we have seen the effects in </w:t>
+      </w:r>
+      <w:r>
+        <w:t>asset bubbles. Business actions</w:t>
+      </w:r>
+      <w:r>
+        <w:t xml:space="preserve"> for </w:t>
+      </w:r>
+      <w:r>
+        <w:t>diversification into heavy industries and quality-focused production</w:t>
+      </w:r>
+      <w:r>
+        <w:t>, accomplished</w:t>
+      </w:r>
+      <w:r>
+        <w:t xml:space="preserve"> high growth but embedded rigidities, such as lifetime employment, that strained adaptability post-1970s</w:t>
+      </w:r>
+      <w:r>
+        <w:rPr>
+          <w:rFonts w:cs="Arial"/>
+          <w:rtl/>
+        </w:rPr>
+        <w:t>.</w:t>
+      </w:r>
+    </w:p>
+    <w:p>
+      <w:pPr>
+        <w:jc w:val="both"/>
+      </w:pPr>
+      <w:r>
+        <w:t xml:space="preserve">Grabowiecki (2006) delves deeper into keiretsu as the postwar successor to zaibatsu, examining their organizational mechanics, governance, and macroeconomic impact. Horizontal keiretsu </w:t>
+      </w:r>
+      <w:r>
+        <w:t xml:space="preserve">for instance </w:t>
+      </w:r>
+      <w:r>
+        <w:t>Mitsui</w:t>
+      </w:r>
+      <w:r>
+        <w:t xml:space="preserve"> and </w:t>
+      </w:r>
+      <w:r>
+        <w:t>Mitsubishi</w:t>
       </w:r>
       <w:r>
         <w:t>,</w:t>
       </w:r>
       <w:r>
-        <w:t xml:space="preserve"> Economic Restructuring, Export-Led Growth, </w:t>
-      </w:r>
-      <w:r>
-        <w:t>Bank of Japan</w:t>
-      </w:r>
-      <w:r>
+        <w:t xml:space="preserve"> featured diversified industries linked by president</w:t>
+      </w:r>
+      <w:r>
+        <w:t>’</w:t>
+      </w:r>
+      <w:r>
+        <w:t>s clubs, cross-shareholding</w:t>
+      </w:r>
+      <w:r>
+        <w:t xml:space="preserve">, </w:t>
+      </w:r>
+      <w:r>
+        <w:t>and main bank relationships. Vertical keiretsu</w:t>
+      </w:r>
+      <w:r>
+        <w:t xml:space="preserve">, </w:t>
+      </w:r>
+      <w:r>
+        <w:t>Toyota</w:t>
+      </w:r>
+      <w:r>
+        <w:t xml:space="preserve"> for example,</w:t>
+      </w:r>
+      <w:r>
+        <w:t xml:space="preserve"> organized tiered supplier networks around a core assembler, emphasizing just-in-time production and long-term contracting</w:t>
+      </w:r>
+      <w:r>
+        <w:rPr>
+          <w:rFonts w:cs="Arial"/>
+          <w:rtl/>
+        </w:rPr>
         <w:t>.</w:t>
       </w:r>
     </w:p>
     <w:p>
       <w:pPr>
-        <w:bidi w:val="0"/>
-      </w:pPr>
-    </w:p>
-    <w:p>
-      <w:pPr>
-        <w:bidi w:val="0"/>
-      </w:pPr>
-    </w:p>
+        <w:jc w:val="both"/>
+      </w:pPr>
+      <w:r>
+        <w:t>Business owners in these groups acted strategically at multiple inflection points. During high growth, they channeled U.S. aid, Korean War procurements, and domestic savings into capital-intensive sectors. Policies like the Income Doubling Plan (1960) provided indicative guidance, while financial repression (low interest rates, directed credit) supported keiretsu expansion. Grabowiecki highlights functions such as information sharing (via sogo shosha trading companies), risk distribution (mutual support during downturns), internal capital markets (reducing external financing costs), and strategic coordination (joint R&amp;D and market entry). These mechanisms lowered transaction costs compared to arm's-length Western markets, enabling rapid scaling</w:t>
+      </w:r>
+      <w:r>
+        <w:rPr>
+          <w:rFonts w:cs="Arial"/>
+          <w:rtl/>
+        </w:rPr>
+        <w:t>.</w:t>
+      </w:r>
+    </w:p>
+    <w:p>
+      <w:pPr>
+        <w:jc w:val="both"/>
+      </w:pPr>
+      <w:r>
+        <w:t xml:space="preserve">Empirical outcomes were impressive: keiretsu firms achieved superior productivity, technological upgrading, and export competitiveness, closing the gap with Western economies. Grabowiecki notes their role in "industrial dirigisme," where state-created capital flowed efficiently through group channels, mitigating coordination failures in large projects. Cross-shareholding insulated managers from short-term shareholder pressure, fostering patient capital and innovation diffusion. Labor </w:t>
+      </w:r>
+      <w:r>
+        <w:t xml:space="preserve">unions </w:t>
+      </w:r>
+      <w:r>
+        <w:t>further aligned worker and firm interests, boosting morale and firm-specific skills</w:t>
+      </w:r>
+      <w:r>
+        <w:rPr>
+          <w:rFonts w:cs="Arial"/>
+          <w:rtl/>
+        </w:rPr>
+        <w:t>.</w:t>
+      </w:r>
+    </w:p>
+    <w:p>
+      <w:pPr>
+        <w:jc w:val="both"/>
+      </w:pPr>
+      <w:r>
+        <w:t>However, Grabowiecki cautions on long-term drawbacks. By the 1980s–1990s, keiretsu rigidity contributed to inefficiency amid globalization and financial deregulation. "Success as the source of failure" dynamics emerged, where cooperative norms discouraged radical innovation and exit from declining sectors. Comparative analysis with Polish and other transition economies suggests keiretsu-like groups require specific institutional preconditions (trust, main bank stability) not easily replicated. Business adaptation post-bubble involved unwinding cross-holdings and internationalizing, but with mixed results due to legacy commitments</w:t>
+      </w:r>
+      <w:r>
+        <w:rPr>
+          <w:rFonts w:cs="Arial"/>
+          <w:rtl/>
+        </w:rPr>
+        <w:t>.</w:t>
+      </w:r>
+    </w:p>
+    <w:p>
+      <w:pPr>
+        <w:jc w:val="both"/>
+      </w:pPr>
+      <w:r>
+        <w:t>Takada (1999) complements the structural focus of the prior works by emphasizing multifaceted underlying factors and business strategies during the miracle. SCAP reforms</w:t>
+      </w:r>
+      <w:r>
+        <w:t xml:space="preserve"> (</w:t>
+      </w:r>
+      <w:r>
+        <w:t>zaibatsu breakup, land reform, and labor democratization</w:t>
+      </w:r>
+      <w:r>
+        <w:t xml:space="preserve">) </w:t>
+      </w:r>
+      <w:r>
+        <w:t>created a level playing field that business leaders exploited. The Korean War (1950–1953) served as an exogenous boost, providing special procurements that injected foreign exchange and demand, enabling technology imports and capacity building</w:t>
+      </w:r>
+      <w:r>
+        <w:rPr>
+          <w:rFonts w:cs="Arial"/>
+          <w:rtl/>
+        </w:rPr>
+        <w:t>.</w:t>
+      </w:r>
+    </w:p>
+    <w:p>
+      <w:pPr>
+        <w:jc w:val="both"/>
+        <w:rPr>
+          <w:rtl/>
+        </w:rPr>
+      </w:pPr>
+      <w:r>
+        <w:t>Business owners prioritized heavy and chemical industries per MITI priorities, investing in imported machinery and process improvements</w:t>
+      </w:r>
+      <w:r>
+        <w:t xml:space="preserve"> </w:t>
+      </w:r>
+      <w:r>
+        <w:t>Takada (1999)</w:t>
+      </w:r>
+      <w:r>
+        <w:t xml:space="preserve">. Strategies included aggressive exporting under undervalued yen (Bretton Woods fixed rate), quality enhancement (inspired by Deming), and supply chain integration within emerging keiretsu. High household savings, channeled through postal savings and banks, </w:t>
+      </w:r>
+      <w:r>
+        <w:lastRenderedPageBreak/>
+        <w:t>financed this without heavy foreign debt. Education expansion produced a disciplined, literate workforce, while cultural factors like group orientation supported cooperative competition</w:t>
+      </w:r>
+      <w:r>
+        <w:rPr>
+          <w:rFonts w:cs="Arial"/>
+          <w:rtl/>
+        </w:rPr>
+        <w:t>.</w:t>
+      </w:r>
+    </w:p>
+    <w:p>
+      <w:pPr>
+        <w:jc w:val="both"/>
+      </w:pPr>
+      <w:r>
+        <w:t xml:space="preserve">On the international basis, and specifically the foundation of U.S alliance in favor of Japan’s growth, </w:t>
+      </w:r>
+      <w:r>
+        <w:t>Beckley et al. (2018) emphasize the indispensable role of the United States in facilitating Japan’s economic resurgence, framing the U.S.-Japan alliance as a security and economic enabler rather than mere backdrop. Following defeat in World War II, Japan faced devastation, but U.S. occupation policies and subsequent Cold War strategy provided critical support. Business leaders benefited from reduced defense expenditures</w:t>
+      </w:r>
+      <w:r>
+        <w:t xml:space="preserve">, </w:t>
+      </w:r>
+      <w:r>
+        <w:t xml:space="preserve">allowing reallocation of resources toward industrial investment. </w:t>
+      </w:r>
+    </w:p>
+    <w:p>
+      <w:pPr>
+        <w:jc w:val="both"/>
+      </w:pPr>
+      <w:r>
+        <w:t>At key inflection points, such as the immediate postwar recovery and the 1950s–1960s export push, Japanese firms</w:t>
+      </w:r>
+      <w:r>
+        <w:t xml:space="preserve"> (</w:t>
+      </w:r>
+      <w:r>
+        <w:t>reorganizing from dismantled zaibatsu into keiretsu structures</w:t>
+      </w:r>
+      <w:r>
+        <w:t xml:space="preserve">) </w:t>
+      </w:r>
+      <w:r>
+        <w:t xml:space="preserve">capitalized on American procurement during the Korean War and favorable trade terms. Policies like the Security Treaty (1951, revised 1960) insulated Japan from geopolitical risks, freeing capital for MITI-guided industrialization. Beckley et al. argue that without this alliance, Japan’s high savings, educational investments, and industrial policies would have yielded far slower results. </w:t>
+      </w:r>
+    </w:p>
+    <w:p>
+      <w:pPr>
+        <w:jc w:val="both"/>
+      </w:pPr>
+      <w:r>
+        <w:t>Business owners acted pragmatically: adopting American management techniques (e.g., quality control), investing in heavy industries, and pursuing scale via group coordination. Outcomes included rapid GDP expansion (averaging over 10% annually during the high-growth era), technological leapfrogging, and Japan’s emergence as a global exporter. However, the paper notes dependencies—over-reliance on U.S. markets exposed vulnerabilities during later shocks like the Nixon administration’s policy shifts. Beckley et al. (2018) thus portray the alliance as a double-edged sword: a catalyst for miracle-level growth that embedded structural reliance, influencing business strategies toward export orientation and relational governance well into the late 20th century</w:t>
+      </w:r>
+      <w:r>
+        <w:rPr>
+          <w:rFonts w:cs="Arial"/>
+          <w:rtl/>
+        </w:rPr>
+        <w:t>.</w:t>
+      </w:r>
+    </w:p>
+    <w:p>
+      <w:pPr>
+        <w:jc w:val="both"/>
+      </w:pPr>
+      <w:r>
+        <w:t>G</w:t>
+      </w:r>
+      <w:r>
+        <w:t>oodin</w:t>
+      </w:r>
+      <w:r>
+        <w:t>g (2026) situates Japan’s miracle within evolving international monetary and geopolitical frameworks, analyzing Bretton Woods, the Nixon Shock, and China’s rise as successive inflection points. The fixed exchange rate regime (¥360 per USD) under Bretton Woods provided undervaluation advantages, enabling export competitiveness and stable planning for business leaders. Combined with domestic policies, this fostered capital accumulation and industrial upgrading in sectors prioritized by government-business coordination</w:t>
+      </w:r>
+      <w:r>
+        <w:rPr>
+          <w:rFonts w:cs="Arial"/>
+          <w:rtl/>
+        </w:rPr>
+        <w:t>.</w:t>
+      </w:r>
+    </w:p>
+    <w:p>
+      <w:pPr>
+        <w:jc w:val="both"/>
+      </w:pPr>
+      <w:r>
+        <w:t>Business actions during the miracle era involved heavy borrowing for technology imports and capacity expansion, supported by keiretsu internal markets and MITI direction. Gooding details how the system allowed firms to pursue aggressive market share strategies with predictable costs. The 1971 Nixon Shock—ending dollar-gold convertibility and pressuring yen appreciation—marked a turning point, forcing revaluation, inflation management, and structural adjustment. Japanese companies responded by enhancing productivity, relocating production overseas, and diversifying into high-value goods (e.g., electronics, automobiles). Subsequent China opening and WTO integration intensified competition, shifting global supply chains and pressuring Japan’s model</w:t>
+      </w:r>
+      <w:r>
+        <w:rPr>
+          <w:rFonts w:cs="Arial"/>
+          <w:rtl/>
+        </w:rPr>
+        <w:t>.</w:t>
+      </w:r>
+    </w:p>
+    <w:p>
+      <w:pPr>
+        <w:jc w:val="both"/>
+      </w:pPr>
+      <w:r>
+        <w:t xml:space="preserve">Policy responses included floating the yen, fiscal stimulus, and later </w:t>
+      </w:r>
+      <w:r>
+        <w:t>“</w:t>
+      </w:r>
+      <w:r>
+        <w:t>Abenomics-style reforms,</w:t>
+      </w:r>
+      <w:r>
+        <w:t>”</w:t>
+      </w:r>
+      <w:r>
+        <w:t xml:space="preserve"> but Gooding critiques delays in addressing keiretsu rigidities and demographic challenges. Economic outcomes were dual: the miracle delivered world-second-largest economy status by the late 1960s, with gains in living standards and infrastructure; yet post-1990s stagnation (“Lost Decades”) reflected adjustment frictions, asset bubbles, and relative declin</w:t>
+      </w:r>
+      <w:r>
+        <w:t>e</w:t>
+      </w:r>
+      <w:r>
+        <w:t xml:space="preserve">. Gooding integrates institutional economics and developmental state theory, arguing that synergistic interactions of undervalued currency, and business </w:t>
+      </w:r>
+      <w:r>
+        <w:t>relationships</w:t>
+      </w:r>
+      <w:r>
+        <w:t xml:space="preserve"> explain the rise, while global </w:t>
+      </w:r>
+      <w:r>
+        <w:t xml:space="preserve">had limitations being forced through the economy. </w:t>
+      </w:r>
+    </w:p>
+    <w:p>
+      <w:pPr>
+        <w:jc w:val="both"/>
+        <w:rPr>
+          <w:rFonts w:cs="Arial"/>
+        </w:rPr>
+      </w:pPr>
+      <w:r>
+        <w:lastRenderedPageBreak/>
+        <w:t xml:space="preserve">Yoshioka and Kawasaki (2016) focus on Japan’s internal economic planning apparatus, detailing fiscal, monetary, and indicative planning tools that guided high-growth policies. Postwar </w:t>
+      </w:r>
+      <w:r>
+        <w:t xml:space="preserve">policies </w:t>
+      </w:r>
+      <w:r>
+        <w:t>from the</w:t>
+      </w:r>
+      <w:r>
+        <w:t xml:space="preserve"> economic institutions like keiretsu to the</w:t>
+      </w:r>
+      <w:r>
+        <w:t xml:space="preserve"> </w:t>
+      </w:r>
+      <w:r>
+        <w:t>n</w:t>
+      </w:r>
+      <w:r>
+        <w:t xml:space="preserve">ational </w:t>
+      </w:r>
+      <w:r>
+        <w:t>i</w:t>
+      </w:r>
+      <w:r>
+        <w:t xml:space="preserve">ncome </w:t>
+      </w:r>
+      <w:r>
+        <w:t>d</w:t>
+      </w:r>
+      <w:r>
+        <w:t xml:space="preserve">oubling </w:t>
+      </w:r>
+      <w:r>
+        <w:t>p</w:t>
+      </w:r>
+      <w:r>
+        <w:t>lan</w:t>
+      </w:r>
+      <w:r>
+        <w:t xml:space="preserve"> </w:t>
+      </w:r>
+      <w:r>
+        <w:t>served dual roles</w:t>
+      </w:r>
+      <w:r>
+        <w:t>. Firstly,</w:t>
+      </w:r>
+      <w:r>
+        <w:t xml:space="preserve"> coordinating government actions to avoid inconsistencies</w:t>
+      </w:r>
+      <w:r>
+        <w:t>, and secondly,</w:t>
+      </w:r>
+      <w:r>
+        <w:t xml:space="preserve"> signaling private sector expectations. Business owners used these as roadmaps for investment, aligning production with projected demand in targeted industries</w:t>
+      </w:r>
+      <w:r>
+        <w:rPr>
+          <w:rFonts w:cs="Arial"/>
+          <w:rtl/>
+        </w:rPr>
+        <w:t>.</w:t>
+      </w:r>
+      <w:r>
+        <w:rPr>
+          <w:rFonts w:cs="Arial"/>
+        </w:rPr>
+        <w:t xml:space="preserve"> They also </w:t>
+      </w:r>
+      <w:r>
+        <w:t>examine policy instruments such as low-interest loans via the Japan Development Bank, tax incentives for exports, and MITI administrative guidance. These facilitated capital deepening and structural shifts from light to heavy industries. Coordination mechanisms ensured monetary</w:t>
+      </w:r>
+      <w:r>
+        <w:t>, and fiscal</w:t>
+      </w:r>
+      <w:r>
+        <w:t xml:space="preserve"> stability</w:t>
+      </w:r>
+      <w:r>
+        <w:t>. To which served as</w:t>
+      </w:r>
+      <w:r>
+        <w:t xml:space="preserve"> enabling sustained high investment rates without overheating</w:t>
+      </w:r>
+      <w:r>
+        <w:t xml:space="preserve"> the economy</w:t>
+      </w:r>
+      <w:r>
+        <w:t>. At inflection points like trade liberalization (1960s), plans helped businesses adapt by forecasting opportunities and mitigating risks</w:t>
+      </w:r>
+      <w:r>
+        <w:rPr>
+          <w:rFonts w:cs="Arial"/>
+          <w:rtl/>
+        </w:rPr>
+        <w:t>.</w:t>
+      </w:r>
+    </w:p>
+    <w:p>
+      <w:pPr>
+        <w:jc w:val="both"/>
+      </w:pPr>
+      <w:r>
+        <w:rPr>
+          <w:rFonts w:cs="Arial"/>
+        </w:rPr>
+        <w:t xml:space="preserve">Each of these studies compiles a vital piece of the puzzle regarding the dynamics at Japan’s key economic inflection points and the external factors that shaped its postwar </w:t>
+      </w:r>
+      <w:r>
+        <w:rPr>
+          <w:rFonts w:cs="Arial"/>
+        </w:rPr>
+        <w:t>growth</w:t>
+      </w:r>
+      <w:r>
+        <w:rPr>
+          <w:rFonts w:cs="Arial"/>
+        </w:rPr>
+        <w:t>. Collectively, they reveal how Japan infused its economic institutions with mechanisms most suitable to its industrial context in the aftermath of World War II</w:t>
+      </w:r>
+      <w:r>
+        <w:rPr>
+          <w:rFonts w:cs="Arial"/>
+        </w:rPr>
+        <w:t xml:space="preserve">; </w:t>
+      </w:r>
+      <w:r>
+        <w:rPr>
+          <w:rFonts w:cs="Arial"/>
+        </w:rPr>
+        <w:t>ranging from U.S.-backed security and market access to indicative planning and adaptive keiretsu governance. The distinctiveness of Japan’s model, particularly when contrasted with liberal market economies elsewhere, renders it a compelling case for scholarly attention. Understanding what elevated Japan as a “house for titans”</w:t>
+      </w:r>
+      <w:r>
+        <w:rPr>
+          <w:rFonts w:cs="Arial"/>
+        </w:rPr>
+        <w:t xml:space="preserve"> </w:t>
+      </w:r>
+      <w:r>
+        <w:rPr>
+          <w:rFonts w:cs="Arial"/>
+        </w:rPr>
+        <w:t>provides essential context for evaluating the miracle’s successes and limitations. These works thus not only document historical outcomes but also equip researchers with analytical tools to assess the interplay of agency and structure, offering transferable insights for other late-industrializing economies while highlighting the contingent nature of sustained competitiveness in a changing world order.</w:t>
+      </w:r>
+    </w:p>
+    <w:p/>
     <w:p>
       <w:r>
         <w:br w:type="page"/>
       </w:r>
     </w:p>
+    <w:p/>
+    <w:p/>
+    <w:p>
+      <w:r>
+        <w:br w:type="page"/>
+      </w:r>
+    </w:p>
+    <w:p/>
+    <w:p/>
     <w:tbl>
       <w:tblPr>
-        <w:tblpPr w:leftFromText="180" w:rightFromText="180" w:vertAnchor="text" w:horzAnchor="page" w:tblpX="8605" w:tblpY="1"/>
+        <w:tblpPr w:leftFromText="180" w:rightFromText="180" w:vertAnchor="text" w:horzAnchor="page" w:tblpX="9331" w:tblpY="1"/>
         <w:tblW w:w="0" w:type="auto"/>
         <w:tblBorders>
           <w:top w:val="single" w:sz="4" w:space="0" w:color="auto"/>
@@ -249,7 +1236,7 @@
           </w:tcPr>
           <w:p>
             <w:pPr>
-              <w:bidi w:val="0"/>
+              <w:bidi/>
               <w:ind w:firstLine="0"/>
               <w:jc w:val="center"/>
               <w:rPr>
@@ -260,7 +1247,6 @@
               <w:rPr>
                 <w:iCs/>
               </w:rPr>
-              <w:lastRenderedPageBreak/>
               <w:t>0</w:t>
             </w:r>
           </w:p>
@@ -282,7 +1268,6 @@
           </w:tcPr>
           <w:p>
             <w:pPr>
-              <w:bidi w:val="0"/>
               <w:ind w:firstLine="0"/>
               <w:jc w:val="center"/>
               <w:rPr>
@@ -293,7 +1278,7 @@
               <w:rPr>
                 <w:iCs/>
               </w:rPr>
-              <w:t>15</w:t>
+              <w:t>0</w:t>
             </w:r>
           </w:p>
         </w:tc>
@@ -314,7 +1299,6 @@
           </w:tcPr>
           <w:p>
             <w:pPr>
-              <w:bidi w:val="0"/>
               <w:ind w:firstLine="0"/>
               <w:jc w:val="center"/>
               <w:rPr>
@@ -325,7 +1309,7 @@
               <w:rPr>
                 <w:iCs/>
               </w:rPr>
-              <w:t>35</w:t>
+              <w:t>0</w:t>
             </w:r>
           </w:p>
         </w:tc>
@@ -346,7 +1330,6 @@
           </w:tcPr>
           <w:p>
             <w:pPr>
-              <w:bidi w:val="0"/>
               <w:ind w:firstLine="0"/>
               <w:jc w:val="center"/>
               <w:rPr>
@@ -357,7 +1340,7 @@
               <w:rPr>
                 <w:iCs/>
               </w:rPr>
-              <w:t>50</w:t>
+              <w:t>30</w:t>
             </w:r>
           </w:p>
         </w:tc>
@@ -378,7 +1361,6 @@
           </w:tcPr>
           <w:p>
             <w:pPr>
-              <w:bidi w:val="0"/>
               <w:ind w:firstLine="0"/>
               <w:jc w:val="center"/>
               <w:rPr>
@@ -389,7 +1371,7 @@
               <w:rPr>
                 <w:iCs/>
               </w:rPr>
-              <w:t>80</w:t>
+              <w:t>30</w:t>
             </w:r>
           </w:p>
         </w:tc>
@@ -410,7 +1392,6 @@
           </w:tcPr>
           <w:p>
             <w:pPr>
-              <w:bidi w:val="0"/>
               <w:ind w:firstLine="0"/>
               <w:jc w:val="center"/>
               <w:rPr>
@@ -421,7 +1402,7 @@
               <w:rPr>
                 <w:iCs/>
               </w:rPr>
-              <w:t>85</w:t>
+              <w:t>5</w:t>
             </w:r>
           </w:p>
         </w:tc>
@@ -442,7 +1423,6 @@
           </w:tcPr>
           <w:p>
             <w:pPr>
-              <w:bidi w:val="0"/>
               <w:ind w:firstLine="0"/>
               <w:jc w:val="center"/>
               <w:rPr>
@@ -453,7 +1433,7 @@
               <w:rPr>
                 <w:iCs/>
               </w:rPr>
-              <w:t>90</w:t>
+              <w:t>5</w:t>
             </w:r>
           </w:p>
         </w:tc>
@@ -474,7 +1454,6 @@
           </w:tcPr>
           <w:p>
             <w:pPr>
-              <w:bidi w:val="0"/>
               <w:ind w:firstLine="0"/>
               <w:jc w:val="center"/>
               <w:rPr>
@@ -485,7 +1464,7 @@
               <w:rPr>
                 <w:iCs/>
               </w:rPr>
-              <w:t>93</w:t>
+              <w:t>3</w:t>
             </w:r>
           </w:p>
         </w:tc>
@@ -506,7 +1485,6 @@
           </w:tcPr>
           <w:p>
             <w:pPr>
-              <w:bidi w:val="0"/>
               <w:ind w:firstLine="0"/>
               <w:jc w:val="center"/>
               <w:rPr>
@@ -517,7 +1495,7 @@
               <w:rPr>
                 <w:iCs/>
               </w:rPr>
-              <w:t>95</w:t>
+              <w:t>0</w:t>
             </w:r>
           </w:p>
         </w:tc>
@@ -538,7 +1516,6 @@
           </w:tcPr>
           <w:p>
             <w:pPr>
-              <w:bidi w:val="0"/>
               <w:ind w:firstLine="0"/>
               <w:jc w:val="center"/>
               <w:rPr>
@@ -549,7 +1526,7 @@
               <w:rPr>
                 <w:iCs/>
               </w:rPr>
-              <w:t>100</w:t>
+              <w:t>5</w:t>
             </w:r>
           </w:p>
         </w:tc>
@@ -589,6 +1566,7 @@
           </w:tcPr>
           <w:p>
             <w:pPr>
+              <w:bidi/>
               <w:ind w:firstLine="0"/>
               <w:jc w:val="center"/>
             </w:pPr>
@@ -614,7 +1592,6 @@
           </w:tcPr>
           <w:p>
             <w:pPr>
-              <w:bidi w:val="0"/>
               <w:ind w:firstLine="0"/>
               <w:jc w:val="center"/>
             </w:pPr>
@@ -640,7 +1617,6 @@
           </w:tcPr>
           <w:p>
             <w:pPr>
-              <w:bidi w:val="0"/>
               <w:ind w:firstLine="0"/>
               <w:jc w:val="center"/>
             </w:pPr>
@@ -666,7 +1642,6 @@
           </w:tcPr>
           <w:p>
             <w:pPr>
-              <w:bidi w:val="0"/>
               <w:ind w:firstLine="0"/>
               <w:jc w:val="center"/>
             </w:pPr>
@@ -692,7 +1667,6 @@
           </w:tcPr>
           <w:p>
             <w:pPr>
-              <w:bidi w:val="0"/>
               <w:ind w:firstLine="0"/>
               <w:jc w:val="center"/>
             </w:pPr>
@@ -718,7 +1692,6 @@
           </w:tcPr>
           <w:p>
             <w:pPr>
-              <w:bidi w:val="0"/>
               <w:ind w:firstLine="0"/>
               <w:jc w:val="center"/>
             </w:pPr>
@@ -744,7 +1717,6 @@
           </w:tcPr>
           <w:p>
             <w:pPr>
-              <w:bidi w:val="0"/>
               <w:ind w:firstLine="0"/>
               <w:jc w:val="center"/>
             </w:pPr>
@@ -770,7 +1742,6 @@
           </w:tcPr>
           <w:p>
             <w:pPr>
-              <w:bidi w:val="0"/>
               <w:ind w:firstLine="0"/>
               <w:jc w:val="center"/>
             </w:pPr>
@@ -796,7 +1767,6 @@
           </w:tcPr>
           <w:p>
             <w:pPr>
-              <w:bidi w:val="0"/>
               <w:ind w:firstLine="0"/>
               <w:jc w:val="center"/>
             </w:pPr>
@@ -822,7 +1792,6 @@
           </w:tcPr>
           <w:p>
             <w:pPr>
-              <w:bidi w:val="0"/>
               <w:ind w:firstLine="0"/>
               <w:jc w:val="center"/>
             </w:pPr>
@@ -833,9 +1802,338 @@
         </w:tc>
       </w:tr>
     </w:tbl>
-    <w:p>
-      <w:pPr>
-        <w:bidi w:val="0"/>
+    <w:tbl>
+      <w:tblPr>
+        <w:tblpPr w:leftFromText="180" w:rightFromText="180" w:vertAnchor="text" w:horzAnchor="page" w:tblpX="8557" w:tblpY="1"/>
+        <w:tblW w:w="0" w:type="auto"/>
+        <w:tblBorders>
+          <w:top w:val="single" w:sz="4" w:space="0" w:color="auto"/>
+          <w:left w:val="single" w:sz="4" w:space="0" w:color="auto"/>
+          <w:bottom w:val="single" w:sz="4" w:space="0" w:color="auto"/>
+          <w:right w:val="single" w:sz="4" w:space="0" w:color="auto"/>
+          <w:insideH w:val="single" w:sz="4" w:space="0" w:color="auto"/>
+          <w:insideV w:val="single" w:sz="4" w:space="0" w:color="auto"/>
+        </w:tblBorders>
+        <w:tblLayout w:type="fixed"/>
+        <w:tblLook w:val="0000" w:firstRow="0" w:lastRow="0" w:firstColumn="0" w:lastColumn="0" w:noHBand="0" w:noVBand="0"/>
+      </w:tblPr>
+      <w:tblGrid>
+        <w:gridCol w:w="725"/>
+      </w:tblGrid>
+      <w:tr>
+        <w:tblPrEx>
+          <w:tblCellMar>
+            <w:top w:w="0" w:type="dxa"/>
+            <w:bottom w:w="0" w:type="dxa"/>
+          </w:tblCellMar>
+        </w:tblPrEx>
+        <w:trPr>
+          <w:trHeight w:val="101"/>
+        </w:trPr>
+        <w:tc>
+          <w:tcPr>
+            <w:tcW w:w="725" w:type="dxa"/>
+          </w:tcPr>
+          <w:p>
+            <w:pPr>
+              <w:bidi/>
+              <w:ind w:firstLine="0"/>
+              <w:jc w:val="center"/>
+              <w:rPr>
+                <w:iCs/>
+              </w:rPr>
+            </w:pPr>
+            <w:r>
+              <w:rPr>
+                <w:iCs/>
+              </w:rPr>
+              <w:t>0</w:t>
+            </w:r>
+          </w:p>
+        </w:tc>
+      </w:tr>
+      <w:tr>
+        <w:tblPrEx>
+          <w:tblCellMar>
+            <w:top w:w="0" w:type="dxa"/>
+            <w:bottom w:w="0" w:type="dxa"/>
+          </w:tblCellMar>
+        </w:tblPrEx>
+        <w:trPr>
+          <w:trHeight w:val="106"/>
+        </w:trPr>
+        <w:tc>
+          <w:tcPr>
+            <w:tcW w:w="725" w:type="dxa"/>
+          </w:tcPr>
+          <w:p>
+            <w:pPr>
+              <w:ind w:firstLine="0"/>
+              <w:jc w:val="center"/>
+              <w:rPr>
+                <w:iCs/>
+              </w:rPr>
+            </w:pPr>
+            <w:r>
+              <w:rPr>
+                <w:iCs/>
+              </w:rPr>
+              <w:t>0</w:t>
+            </w:r>
+          </w:p>
+        </w:tc>
+      </w:tr>
+      <w:tr>
+        <w:tblPrEx>
+          <w:tblCellMar>
+            <w:top w:w="0" w:type="dxa"/>
+            <w:bottom w:w="0" w:type="dxa"/>
+          </w:tblCellMar>
+        </w:tblPrEx>
+        <w:trPr>
+          <w:trHeight w:val="113"/>
+        </w:trPr>
+        <w:tc>
+          <w:tcPr>
+            <w:tcW w:w="725" w:type="dxa"/>
+          </w:tcPr>
+          <w:p>
+            <w:pPr>
+              <w:ind w:firstLine="0"/>
+              <w:jc w:val="center"/>
+              <w:rPr>
+                <w:iCs/>
+              </w:rPr>
+            </w:pPr>
+            <w:r>
+              <w:rPr>
+                <w:iCs/>
+              </w:rPr>
+              <w:t>0</w:t>
+            </w:r>
+          </w:p>
+        </w:tc>
+      </w:tr>
+      <w:tr>
+        <w:tblPrEx>
+          <w:tblCellMar>
+            <w:top w:w="0" w:type="dxa"/>
+            <w:bottom w:w="0" w:type="dxa"/>
+          </w:tblCellMar>
+        </w:tblPrEx>
+        <w:trPr>
+          <w:trHeight w:val="158"/>
+        </w:trPr>
+        <w:tc>
+          <w:tcPr>
+            <w:tcW w:w="725" w:type="dxa"/>
+          </w:tcPr>
+          <w:p>
+            <w:pPr>
+              <w:ind w:firstLine="0"/>
+              <w:jc w:val="center"/>
+              <w:rPr>
+                <w:iCs/>
+              </w:rPr>
+            </w:pPr>
+            <w:r>
+              <w:rPr>
+                <w:iCs/>
+              </w:rPr>
+              <w:t>50</w:t>
+            </w:r>
+          </w:p>
+        </w:tc>
+      </w:tr>
+      <w:tr>
+        <w:tblPrEx>
+          <w:tblCellMar>
+            <w:top w:w="0" w:type="dxa"/>
+            <w:bottom w:w="0" w:type="dxa"/>
+          </w:tblCellMar>
+        </w:tblPrEx>
+        <w:trPr>
+          <w:trHeight w:val="209"/>
+        </w:trPr>
+        <w:tc>
+          <w:tcPr>
+            <w:tcW w:w="725" w:type="dxa"/>
+          </w:tcPr>
+          <w:p>
+            <w:pPr>
+              <w:ind w:firstLine="0"/>
+              <w:jc w:val="center"/>
+              <w:rPr>
+                <w:iCs/>
+              </w:rPr>
+            </w:pPr>
+            <w:r>
+              <w:rPr>
+                <w:iCs/>
+              </w:rPr>
+              <w:t>80</w:t>
+            </w:r>
+          </w:p>
+        </w:tc>
+      </w:tr>
+      <w:tr>
+        <w:tblPrEx>
+          <w:tblCellMar>
+            <w:top w:w="0" w:type="dxa"/>
+            <w:bottom w:w="0" w:type="dxa"/>
+          </w:tblCellMar>
+        </w:tblPrEx>
+        <w:trPr>
+          <w:trHeight w:val="260"/>
+        </w:trPr>
+        <w:tc>
+          <w:tcPr>
+            <w:tcW w:w="725" w:type="dxa"/>
+          </w:tcPr>
+          <w:p>
+            <w:pPr>
+              <w:ind w:firstLine="0"/>
+              <w:jc w:val="center"/>
+              <w:rPr>
+                <w:iCs/>
+              </w:rPr>
+            </w:pPr>
+            <w:r>
+              <w:rPr>
+                <w:iCs/>
+              </w:rPr>
+              <w:t>85</w:t>
+            </w:r>
+          </w:p>
+        </w:tc>
+      </w:tr>
+      <w:tr>
+        <w:tblPrEx>
+          <w:tblCellMar>
+            <w:top w:w="0" w:type="dxa"/>
+            <w:bottom w:w="0" w:type="dxa"/>
+          </w:tblCellMar>
+        </w:tblPrEx>
+        <w:trPr>
+          <w:trHeight w:val="183"/>
+        </w:trPr>
+        <w:tc>
+          <w:tcPr>
+            <w:tcW w:w="725" w:type="dxa"/>
+          </w:tcPr>
+          <w:p>
+            <w:pPr>
+              <w:ind w:firstLine="0"/>
+              <w:jc w:val="center"/>
+              <w:rPr>
+                <w:iCs/>
+              </w:rPr>
+            </w:pPr>
+            <w:r>
+              <w:rPr>
+                <w:iCs/>
+              </w:rPr>
+              <w:t>90</w:t>
+            </w:r>
+          </w:p>
+        </w:tc>
+      </w:tr>
+      <w:tr>
+        <w:tblPrEx>
+          <w:tblCellMar>
+            <w:top w:w="0" w:type="dxa"/>
+            <w:bottom w:w="0" w:type="dxa"/>
+          </w:tblCellMar>
+        </w:tblPrEx>
+        <w:trPr>
+          <w:trHeight w:val="195"/>
+        </w:trPr>
+        <w:tc>
+          <w:tcPr>
+            <w:tcW w:w="725" w:type="dxa"/>
+          </w:tcPr>
+          <w:p>
+            <w:pPr>
+              <w:ind w:firstLine="0"/>
+              <w:jc w:val="center"/>
+              <w:rPr>
+                <w:iCs/>
+              </w:rPr>
+            </w:pPr>
+            <w:r>
+              <w:rPr>
+                <w:iCs/>
+              </w:rPr>
+              <w:t>93</w:t>
+            </w:r>
+          </w:p>
+        </w:tc>
+      </w:tr>
+      <w:tr>
+        <w:tblPrEx>
+          <w:tblCellMar>
+            <w:top w:w="0" w:type="dxa"/>
+            <w:bottom w:w="0" w:type="dxa"/>
+          </w:tblCellMar>
+        </w:tblPrEx>
+        <w:trPr>
+          <w:trHeight w:val="215"/>
+        </w:trPr>
+        <w:tc>
+          <w:tcPr>
+            <w:tcW w:w="725" w:type="dxa"/>
+          </w:tcPr>
+          <w:p>
+            <w:pPr>
+              <w:ind w:firstLine="0"/>
+              <w:jc w:val="center"/>
+              <w:rPr>
+                <w:iCs/>
+              </w:rPr>
+            </w:pPr>
+            <w:r>
+              <w:rPr>
+                <w:iCs/>
+              </w:rPr>
+              <w:t>95</w:t>
+            </w:r>
+          </w:p>
+        </w:tc>
+      </w:tr>
+      <w:tr>
+        <w:tblPrEx>
+          <w:tblCellMar>
+            <w:top w:w="0" w:type="dxa"/>
+            <w:bottom w:w="0" w:type="dxa"/>
+          </w:tblCellMar>
+        </w:tblPrEx>
+        <w:trPr>
+          <w:trHeight w:val="427"/>
+        </w:trPr>
+        <w:tc>
+          <w:tcPr>
+            <w:tcW w:w="725" w:type="dxa"/>
+          </w:tcPr>
+          <w:p>
+            <w:pPr>
+              <w:ind w:firstLine="0"/>
+              <w:jc w:val="center"/>
+              <w:rPr>
+                <w:iCs/>
+              </w:rPr>
+            </w:pPr>
+            <w:r>
+              <w:rPr>
+                <w:iCs/>
+              </w:rPr>
+              <w:t>100</w:t>
+            </w:r>
+          </w:p>
+        </w:tc>
+      </w:tr>
+    </w:tbl>
+    <w:p>
+      <w:pPr>
         <w:rPr>
           <w:strike/>
         </w:rPr>
@@ -863,10 +2161,34 @@
     </w:p>
     <w:p>
       <w:pPr>
-        <w:bidi w:val="0"/>
-      </w:pPr>
-      <w:r>
+        <w:rPr>
+          <w:strike/>
+        </w:rPr>
+      </w:pPr>
+      <w:r>
+        <w:rPr>
+          <w:strike/>
+        </w:rPr>
         <w:t>2</w:t>
+      </w:r>
+      <w:r>
+        <w:rPr>
+          <w:rFonts w:cs="Arial"/>
+          <w:strike/>
+          <w:rtl/>
+        </w:rPr>
+        <w:t xml:space="preserve">- </w:t>
+      </w:r>
+      <w:r>
+        <w:rPr>
+          <w:strike/>
+        </w:rPr>
+        <w:t>surf the internet to find about the literature of this subject</w:t>
+      </w:r>
+    </w:p>
+    <w:p>
+      <w:r>
+        <w:t>3</w:t>
       </w:r>
       <w:r>
         <w:rPr>
@@ -876,15 +2198,12 @@
         <w:t xml:space="preserve">- </w:t>
       </w:r>
       <w:r>
-        <w:t>surf the internet to find about the literature of this subject</w:t>
-      </w:r>
-    </w:p>
-    <w:p>
-      <w:pPr>
-        <w:bidi w:val="0"/>
-      </w:pPr>
-      <w:r>
-        <w:t>3</w:t>
+        <w:t xml:space="preserve">finish the literature </w:t>
+      </w:r>
+    </w:p>
+    <w:p>
+      <w:r>
+        <w:t>4</w:t>
       </w:r>
       <w:r>
         <w:rPr>
@@ -894,15 +2213,12 @@
         <w:t xml:space="preserve">- </w:t>
       </w:r>
       <w:r>
-        <w:t>find out what data do we need for the project</w:t>
-      </w:r>
-    </w:p>
-    <w:p>
-      <w:pPr>
-        <w:bidi w:val="0"/>
-      </w:pPr>
-      <w:r>
-        <w:t>4</w:t>
+        <w:t>get the data to work with</w:t>
+      </w:r>
+    </w:p>
+    <w:p>
+      <w:r>
+        <w:t>5</w:t>
       </w:r>
       <w:r>
         <w:rPr>
@@ -912,15 +2228,12 @@
         <w:t xml:space="preserve">- </w:t>
       </w:r>
       <w:r>
-        <w:t>get the data to work with</w:t>
-      </w:r>
-    </w:p>
-    <w:p>
-      <w:pPr>
-        <w:bidi w:val="0"/>
-      </w:pPr>
-      <w:r>
-        <w:t>5</w:t>
+        <w:t>add the body of the project (which we will talk about later)</w:t>
+      </w:r>
+    </w:p>
+    <w:p>
+      <w:r>
+        <w:t>6</w:t>
       </w:r>
       <w:r>
         <w:rPr>
@@ -930,15 +2243,12 @@
         <w:t xml:space="preserve">- </w:t>
       </w:r>
       <w:r>
-        <w:t>add the body of the project (which we will talk about later)</w:t>
-      </w:r>
-    </w:p>
-    <w:p>
-      <w:pPr>
-        <w:bidi w:val="0"/>
-      </w:pPr>
-      <w:r>
-        <w:t>6</w:t>
+        <w:t>have the conclusion</w:t>
+      </w:r>
+    </w:p>
+    <w:p>
+      <w:r>
+        <w:t>7</w:t>
       </w:r>
       <w:r>
         <w:rPr>
@@ -948,15 +2258,12 @@
         <w:t xml:space="preserve">- </w:t>
       </w:r>
       <w:r>
-        <w:t>have the conclusion</w:t>
-      </w:r>
-    </w:p>
-    <w:p>
-      <w:pPr>
-        <w:bidi w:val="0"/>
-      </w:pPr>
-      <w:r>
-        <w:t>7</w:t>
+        <w:t>write the introduction</w:t>
+      </w:r>
+    </w:p>
+    <w:p>
+      <w:r>
+        <w:t>8</w:t>
       </w:r>
       <w:r>
         <w:rPr>
@@ -966,15 +2273,12 @@
         <w:t xml:space="preserve">- </w:t>
       </w:r>
       <w:r>
-        <w:t>write the introduction</w:t>
-      </w:r>
-    </w:p>
-    <w:p>
-      <w:pPr>
-        <w:bidi w:val="0"/>
-      </w:pPr>
-      <w:r>
-        <w:t>8</w:t>
+        <w:t>write the abstract</w:t>
+      </w:r>
+    </w:p>
+    <w:p>
+      <w:r>
+        <w:t>9</w:t>
       </w:r>
       <w:r>
         <w:rPr>
@@ -984,167 +2288,20 @@
         <w:t xml:space="preserve">- </w:t>
       </w:r>
       <w:r>
-        <w:t>write the abstract</w:t>
-      </w:r>
-    </w:p>
-    <w:p>
-      <w:pPr>
-        <w:bidi w:val="0"/>
-      </w:pPr>
-      <w:r>
-        <w:t>9</w:t>
-      </w:r>
-      <w:r>
-        <w:rPr>
-          <w:rFonts w:cs="Arial"/>
-          <w:rtl/>
-        </w:rPr>
-        <w:t xml:space="preserve">- </w:t>
-      </w:r>
-      <w:r>
         <w:t>have the bibliography attached to the end of the file</w:t>
       </w:r>
     </w:p>
     <w:p>
-      <w:pPr>
-        <w:bidi w:val="0"/>
-      </w:pPr>
       <w:r>
         <w:t>10- check for any errors within that</w:t>
       </w:r>
     </w:p>
     <w:p>
       <w:pPr>
-        <w:bidi w:val="0"/>
-      </w:pPr>
-    </w:p>
-    <w:p>
-      <w:pPr>
-        <w:bidi w:val="0"/>
-      </w:pPr>
-    </w:p>
-    <w:p>
-      <w:pPr>
-        <w:pBdr>
-          <w:bottom w:val="single" w:sz="12" w:space="1" w:color="auto"/>
-        </w:pBdr>
-        <w:bidi w:val="0"/>
-      </w:pPr>
-    </w:p>
-    <w:p>
-      <w:pPr>
-        <w:bidi w:val="0"/>
-      </w:pPr>
-      <w:proofErr w:type="gramStart"/>
-      <w:r>
-        <w:t>  AMERICA'S</w:t>
-      </w:r>
-      <w:proofErr w:type="gramEnd"/>
-      <w:r>
-        <w:t xml:space="preserve"> ROLE IN THE MAKING OF JAPAN'S ECONOMIC MIRACLE" </w:t>
-      </w:r>
-    </w:p>
-    <w:p>
-      <w:pPr>
-        <w:bidi w:val="0"/>
-      </w:pPr>
-      <w:proofErr w:type="gramStart"/>
-      <w:r>
-        <w:t>  "</w:t>
-      </w:r>
-      <w:proofErr w:type="gramEnd"/>
-      <w:r>
-        <w:t xml:space="preserve">Japan's High-Growth Postwar Period: The Role of Economic Plans and Economic Policy" </w:t>
-      </w:r>
-    </w:p>
-    <w:p>
-      <w:pPr>
-        <w:bidi w:val="0"/>
-      </w:pPr>
-      <w:proofErr w:type="gramStart"/>
-      <w:r>
-        <w:t>  "</w:t>
-      </w:r>
-      <w:proofErr w:type="gramEnd"/>
-      <w:r>
-        <w:t xml:space="preserve">The Japanese Economic Miracle: Underlying Factors and..." (Takada) </w:t>
-      </w:r>
-    </w:p>
-    <w:p>
-      <w:pPr>
-        <w:bidi w:val="0"/>
-      </w:pPr>
-      <w:proofErr w:type="gramStart"/>
-      <w:r>
-        <w:t>  "</w:t>
-      </w:r>
-      <w:proofErr w:type="gramEnd"/>
-      <w:r>
-        <w:t xml:space="preserve">Keiretsu Groups: Their Role in the Japanese Economy and a Reference Point or Paradigm for Other Countries" </w:t>
-      </w:r>
-    </w:p>
-    <w:p>
-      <w:pPr>
-        <w:bidi w:val="0"/>
-      </w:pPr>
-      <w:proofErr w:type="gramStart"/>
-      <w:r>
-        <w:t>  "</w:t>
-      </w:r>
-      <w:proofErr w:type="gramEnd"/>
-      <w:r>
-        <w:t xml:space="preserve">The Rise and Fall of the Zaibatsu: Japan's Industrial and..." </w:t>
-      </w:r>
-    </w:p>
-    <w:p>
-      <w:pPr>
-        <w:bidi w:val="0"/>
-      </w:pPr>
-      <w:proofErr w:type="gramStart"/>
-      <w:r>
-        <w:t>  "</w:t>
-      </w:r>
-      <w:proofErr w:type="gramEnd"/>
-      <w:r>
-        <w:t xml:space="preserve">Success as the Source of Failure: Competition and Cooperation in the Japanese Economy" (Tezuka) </w:t>
-      </w:r>
-    </w:p>
-    <w:p>
-      <w:pPr>
-        <w:bidi w:val="0"/>
-      </w:pPr>
-      <w:proofErr w:type="gramStart"/>
-      <w:r>
-        <w:t>  "</w:t>
-      </w:r>
-      <w:proofErr w:type="gramEnd"/>
-      <w:r>
-        <w:t xml:space="preserve">An Economic History of Postwar Japan" </w:t>
-      </w:r>
-    </w:p>
-    <w:p>
-      <w:pPr>
-        <w:bidi w:val="0"/>
-      </w:pPr>
-      <w:proofErr w:type="gramStart"/>
-      <w:r>
-        <w:t>  "</w:t>
-      </w:r>
-      <w:proofErr w:type="gramEnd"/>
-      <w:r>
-        <w:t>Japan's Economic Miracle, Bretton Woods, Nixon, China's Rise..."</w:t>
-      </w:r>
-    </w:p>
-    <w:p>
-      <w:pPr>
-        <w:bidi w:val="0"/>
-      </w:pPr>
-    </w:p>
-    <w:p>
-      <w:pPr>
-        <w:bidi w:val="0"/>
-      </w:pPr>
-    </w:p>
+        <w:ind w:firstLine="0"/>
+      </w:pPr>
+    </w:p>
+    <w:p/>
     <w:p>
       <w:r>
         <w:br w:type="page"/>
@@ -1152,78 +2309,129 @@
     </w:p>
     <w:p>
       <w:pPr>
-        <w:bidi w:val="0"/>
         <w:ind w:firstLine="0"/>
       </w:pPr>
     </w:p>
-    <w:p>
-      <w:pPr>
-        <w:pBdr>
-          <w:bottom w:val="single" w:sz="12" w:space="1" w:color="auto"/>
-        </w:pBdr>
-        <w:bidi w:val="0"/>
-        <w:ind w:firstLine="0"/>
-      </w:pPr>
-    </w:p>
-    <w:p>
-      <w:pPr>
-        <w:bidi w:val="0"/>
-        <w:ind w:firstLine="0"/>
-      </w:pPr>
-      <w:r>
-        <w:t>Bibliography:</w:t>
-      </w:r>
-    </w:p>
-    <w:p>
-      <w:pPr>
-        <w:bidi w:val="0"/>
-        <w:ind w:firstLine="0"/>
-      </w:pPr>
-      <w:r>
-        <w:t>Beckley M, Horiuchi Y, Miller JM. AMERICA’S ROLE IN THE MAKING OF JAPAN’S ECONOMIC MIRACLE. </w:t>
-      </w:r>
-      <w:r>
-        <w:rPr>
-          <w:i/>
-          <w:iCs/>
-        </w:rPr>
-        <w:t>Journal of East Asian Studies</w:t>
-      </w:r>
-      <w:r>
-        <w:t>. 2018;18(1):1-21. doi:10.1017/jea.2017.24</w:t>
-      </w:r>
-    </w:p>
-    <w:p>
-      <w:pPr>
-        <w:bidi w:val="0"/>
-        <w:ind w:firstLine="0"/>
-      </w:pPr>
-      <w:r>
-        <w:t>Takada, Masahiro. “Japan's Economic Miracle: Underlying Factors and Strategies for the Growth.” (1999).</w:t>
-      </w:r>
-    </w:p>
-    <w:p>
-      <w:pPr>
-        <w:bidi w:val="0"/>
-        <w:ind w:firstLine="0"/>
-      </w:pPr>
-      <w:proofErr w:type="spellStart"/>
-      <w:r>
-        <w:t>Grabowiecki</w:t>
-      </w:r>
-      <w:proofErr w:type="spellEnd"/>
-      <w:r>
-        <w:t>, Jerzy. (2006). Keiretsu Groups: Their Role in the Japanese Economy and a Reference Point (or Paradigm) for Other Countries. 413. 1-85.</w:t>
-      </w:r>
-    </w:p>
     <w:sectPr>
+      <w:footerReference w:type="default" r:id="rId8"/>
       <w:pgSz w:w="11906" w:h="16838" w:code="9"/>
-      <w:pgMar w:top="720" w:right="720" w:bottom="720" w:left="720" w:header="576" w:footer="576" w:gutter="0"/>
+      <w:pgMar w:top="1440" w:right="1080" w:bottom="1440" w:left="1080" w:header="576" w:footer="576" w:gutter="0"/>
       <w:cols w:space="720"/>
       <w:docGrid w:linePitch="360"/>
     </w:sectPr>
   </w:body>
 </w:document>
+</file>
+
+<file path=word/endnotes.xml><?xml version="1.0" encoding="utf-8"?>
+<w:endnotes xmlns:wpc="http://schemas.microsoft.com/office/word/2010/wordprocessingCanvas" xmlns:cx="http://schemas.microsoft.com/office/drawing/2014/chartex" xmlns:cx1="http://schemas.microsoft.com/office/drawing/2015/9/8/chartex" xmlns:cx2="http://schemas.microsoft.com/office/drawing/2015/10/21/chartex" xmlns:cx3="http://schemas.microsoft.com/office/drawing/2016/5/9/chartex" xmlns:cx4="http://schemas.microsoft.com/office/drawing/2016/5/10/chartex" xmlns:cx5="http://schemas.microsoft.com/office/drawing/2016/5/11/chartex" xmlns:cx6="http://schemas.microsoft.com/office/drawing/2016/5/12/chartex" xmlns:cx7="http://schemas.microsoft.com/office/drawing/2016/5/13/chartex" xmlns:cx8="http://schemas.microsoft.com/office/drawing/2016/5/14/chartex" xmlns:mc="http://schemas.openxmlformats.org/markup-compatibility/2006" xmlns:aink="http://schemas.microsoft.com/office/drawing/2016/ink" xmlns:am3d="http://schemas.microsoft.com/office/drawing/2017/model3d" xmlns:o="urn:schemas-microsoft-com:office:office" xmlns:oel="http://schemas.microsoft.com/office/2019/extlst" xmlns:r="http://schemas.openxmlformats.org/officeDocument/2006/relationships" xmlns:m="http://schemas.openxmlformats.org/officeDocument/2006/math" xmlns:v="urn:schemas-microsoft-com:vml" xmlns:wp14="http://schemas.microsoft.com/office/word/2010/wordprocessingDrawing" xmlns:wp="http://schemas.openxmlformats.org/drawingml/2006/wordprocessingDrawing" xmlns:w10="urn:schemas-microsoft-com:office:word" xmlns:w="http://schemas.openxmlformats.org/wordprocessingml/2006/main" xmlns:w14="http://schemas.microsoft.com/office/word/2010/wordml" xmlns:w15="http://schemas.microsoft.com/office/word/2012/wordml" xmlns:w16cex="http://schemas.microsoft.com/office/word/2018/wordml/cex" xmlns:w16cid="http://schemas.microsoft.com/office/word/2016/wordml/cid" xmlns:w16="http://schemas.microsoft.com/office/word/2018/wordml" xmlns:w16sdtdh="http://schemas.microsoft.com/office/word/2020/wordml/sdtdatahash" xmlns:w16se="http://schemas.microsoft.com/office/word/2015/wordml/symex" xmlns:wpg="http://schemas.microsoft.com/office/word/2010/wordprocessingGroup" xmlns:wpi="http://schemas.microsoft.com/office/word/2010/wordprocessingInk" xmlns:wne="http://schemas.microsoft.com/office/word/2006/wordml" xmlns:wps="http://schemas.microsoft.com/office/word/2010/wordprocessingShape" mc:Ignorable="w14 w15 w16se w16cid w16 w16cex w16sdtdh wp14">
+  <w:endnote w:type="separator" w:id="-1">
+    <w:p>
+      <w:pPr>
+        <w:spacing w:after="0" w:line="240" w:lineRule="auto"/>
+      </w:pPr>
+      <w:r>
+        <w:separator/>
+      </w:r>
+    </w:p>
+  </w:endnote>
+  <w:endnote w:type="continuationSeparator" w:id="0">
+    <w:p>
+      <w:pPr>
+        <w:spacing w:after="0" w:line="240" w:lineRule="auto"/>
+      </w:pPr>
+      <w:r>
+        <w:continuationSeparator/>
+      </w:r>
+    </w:p>
+  </w:endnote>
+</w:endnotes>
+</file>
+
+<file path=word/footer1.xml><?xml version="1.0" encoding="utf-8"?>
+<w:ftr xmlns:wpc="http://schemas.microsoft.com/office/word/2010/wordprocessingCanvas" xmlns:cx="http://schemas.microsoft.com/office/drawing/2014/chartex" xmlns:cx1="http://schemas.microsoft.com/office/drawing/2015/9/8/chartex" xmlns:cx2="http://schemas.microsoft.com/office/drawing/2015/10/21/chartex" xmlns:cx3="http://schemas.microsoft.com/office/drawing/2016/5/9/chartex" xmlns:cx4="http://schemas.microsoft.com/office/drawing/2016/5/10/chartex" xmlns:cx5="http://schemas.microsoft.com/office/drawing/2016/5/11/chartex" xmlns:cx6="http://schemas.microsoft.com/office/drawing/2016/5/12/chartex" xmlns:cx7="http://schemas.microsoft.com/office/drawing/2016/5/13/chartex" xmlns:cx8="http://schemas.microsoft.com/office/drawing/2016/5/14/chartex" xmlns:mc="http://schemas.openxmlformats.org/markup-compatibility/2006" xmlns:aink="http://schemas.microsoft.com/office/drawing/2016/ink" xmlns:am3d="http://schemas.microsoft.com/office/drawing/2017/model3d" xmlns:o="urn:schemas-microsoft-com:office:office" xmlns:oel="http://schemas.microsoft.com/office/2019/extlst" xmlns:r="http://schemas.openxmlformats.org/officeDocument/2006/relationships" xmlns:m="http://schemas.openxmlformats.org/officeDocument/2006/math" xmlns:v="urn:schemas-microsoft-com:vml" xmlns:wp14="http://schemas.microsoft.com/office/word/2010/wordprocessingDrawing" xmlns:wp="http://schemas.openxmlformats.org/drawingml/2006/wordprocessingDrawing" xmlns:w10="urn:schemas-microsoft-com:office:word" xmlns:w="http://schemas.openxmlformats.org/wordprocessingml/2006/main" xmlns:w14="http://schemas.microsoft.com/office/word/2010/wordml" xmlns:w15="http://schemas.microsoft.com/office/word/2012/wordml" xmlns:w16cex="http://schemas.microsoft.com/office/word/2018/wordml/cex" xmlns:w16cid="http://schemas.microsoft.com/office/word/2016/wordml/cid" xmlns:w16="http://schemas.microsoft.com/office/word/2018/wordml" xmlns:w16sdtdh="http://schemas.microsoft.com/office/word/2020/wordml/sdtdatahash" xmlns:w16se="http://schemas.microsoft.com/office/word/2015/wordml/symex" xmlns:wpg="http://schemas.microsoft.com/office/word/2010/wordprocessingGroup" xmlns:wpi="http://schemas.microsoft.com/office/word/2010/wordprocessingInk" xmlns:wne="http://schemas.microsoft.com/office/word/2006/wordml" xmlns:wps="http://schemas.microsoft.com/office/word/2010/wordprocessingShape" mc:Ignorable="w14 w15 w16se w16cid w16 w16cex w16sdtdh wp14">
+  <w:sdt>
+    <w:sdtPr>
+      <w:id w:val="1206372305"/>
+      <w:docPartObj>
+        <w:docPartGallery w:val="Page Numbers (Bottom of Page)"/>
+        <w:docPartUnique/>
+      </w:docPartObj>
+    </w:sdtPr>
+    <w:sdtEndPr>
+      <w:rPr>
+        <w:rtl/>
+      </w:rPr>
+    </w:sdtEndPr>
+    <w:sdtContent>
+      <w:p>
+        <w:pPr>
+          <w:pStyle w:val="Footer"/>
+          <w:ind w:firstLine="0"/>
+        </w:pPr>
+      </w:p>
+      <w:p>
+        <w:pPr>
+          <w:pStyle w:val="Footer"/>
+          <w:bidi/>
+          <w:jc w:val="center"/>
+        </w:pPr>
+        <w:r>
+          <w:t>[</w:t>
+        </w:r>
+        <w:r>
+          <w:fldChar w:fldCharType="begin"/>
+        </w:r>
+        <w:r>
+          <w:instrText xml:space="preserve"> PAGE   \* MERGEFORMAT </w:instrText>
+        </w:r>
+        <w:r>
+          <w:fldChar w:fldCharType="separate"/>
+        </w:r>
+        <w:r>
+          <w:rPr>
+            <w:noProof/>
+          </w:rPr>
+          <w:t>2</w:t>
+        </w:r>
+        <w:r>
+          <w:rPr>
+            <w:noProof/>
+          </w:rPr>
+          <w:fldChar w:fldCharType="end"/>
+        </w:r>
+        <w:r>
+          <w:t>]</w:t>
+        </w:r>
+      </w:p>
+    </w:sdtContent>
+  </w:sdt>
+</w:ftr>
+</file>
+
+<file path=word/footnotes.xml><?xml version="1.0" encoding="utf-8"?>
+<w:footnotes xmlns:wpc="http://schemas.microsoft.com/office/word/2010/wordprocessingCanvas" xmlns:cx="http://schemas.microsoft.com/office/drawing/2014/chartex" xmlns:cx1="http://schemas.microsoft.com/office/drawing/2015/9/8/chartex" xmlns:cx2="http://schemas.microsoft.com/office/drawing/2015/10/21/chartex" xmlns:cx3="http://schemas.microsoft.com/office/drawing/2016/5/9/chartex" xmlns:cx4="http://schemas.microsoft.com/office/drawing/2016/5/10/chartex" xmlns:cx5="http://schemas.microsoft.com/office/drawing/2016/5/11/chartex" xmlns:cx6="http://schemas.microsoft.com/office/drawing/2016/5/12/chartex" xmlns:cx7="http://schemas.microsoft.com/office/drawing/2016/5/13/chartex" xmlns:cx8="http://schemas.microsoft.com/office/drawing/2016/5/14/chartex" xmlns:mc="http://schemas.openxmlformats.org/markup-compatibility/2006" xmlns:aink="http://schemas.microsoft.com/office/drawing/2016/ink" xmlns:am3d="http://schemas.microsoft.com/office/drawing/2017/model3d" xmlns:o="urn:schemas-microsoft-com:office:office" xmlns:oel="http://schemas.microsoft.com/office/2019/extlst" xmlns:r="http://schemas.openxmlformats.org/officeDocument/2006/relationships" xmlns:m="http://schemas.openxmlformats.org/officeDocument/2006/math" xmlns:v="urn:schemas-microsoft-com:vml" xmlns:wp14="http://schemas.microsoft.com/office/word/2010/wordprocessingDrawing" xmlns:wp="http://schemas.openxmlformats.org/drawingml/2006/wordprocessingDrawing" xmlns:w10="urn:schemas-microsoft-com:office:word" xmlns:w="http://schemas.openxmlformats.org/wordprocessingml/2006/main" xmlns:w14="http://schemas.microsoft.com/office/word/2010/wordml" xmlns:w15="http://schemas.microsoft.com/office/word/2012/wordml" xmlns:w16cex="http://schemas.microsoft.com/office/word/2018/wordml/cex" xmlns:w16cid="http://schemas.microsoft.com/office/word/2016/wordml/cid" xmlns:w16="http://schemas.microsoft.com/office/word/2018/wordml" xmlns:w16sdtdh="http://schemas.microsoft.com/office/word/2020/wordml/sdtdatahash" xmlns:w16se="http://schemas.microsoft.com/office/word/2015/wordml/symex" xmlns:wpg="http://schemas.microsoft.com/office/word/2010/wordprocessingGroup" xmlns:wpi="http://schemas.microsoft.com/office/word/2010/wordprocessingInk" xmlns:wne="http://schemas.microsoft.com/office/word/2006/wordml" xmlns:wps="http://schemas.microsoft.com/office/word/2010/wordprocessingShape" mc:Ignorable="w14 w15 w16se w16cid w16 w16cex w16sdtdh wp14">
+  <w:footnote w:type="separator" w:id="-1">
+    <w:p>
+      <w:pPr>
+        <w:spacing w:after="0" w:line="240" w:lineRule="auto"/>
+      </w:pPr>
+      <w:r>
+        <w:separator/>
+      </w:r>
+    </w:p>
+  </w:footnote>
+  <w:footnote w:type="continuationSeparator" w:id="0">
+    <w:p>
+      <w:pPr>
+        <w:spacing w:after="0" w:line="240" w:lineRule="auto"/>
+      </w:pPr>
+      <w:r>
+        <w:continuationSeparator/>
+      </w:r>
+    </w:p>
+  </w:footnote>
+</w:footnotes>
 </file>
 
 <file path=word/numbering.xml><?xml version="1.0" encoding="utf-8"?>
@@ -1363,7 +2571,6 @@
     </w:rPrDefault>
     <w:pPrDefault>
       <w:pPr>
-        <w:bidi/>
         <w:spacing w:after="160" w:line="278" w:lineRule="auto"/>
         <w:ind w:firstLine="288"/>
       </w:pPr>
@@ -1801,7 +3008,6 @@
     <w:next w:val="Normal"/>
     <w:link w:val="Heading3Char"/>
     <w:uiPriority w:val="9"/>
-    <w:semiHidden/>
     <w:unhideWhenUsed/>
     <w:qFormat/>
     <w:rsid w:val="002B6FAD"/>
@@ -2008,7 +3214,6 @@
     <w:basedOn w:val="DefaultParagraphFont"/>
     <w:link w:val="Heading3"/>
     <w:uiPriority w:val="9"/>
-    <w:semiHidden/>
     <w:rsid w:val="002B6FAD"/>
     <w:rPr>
       <w:rFonts w:asciiTheme="minorHAnsi" w:eastAsiaTheme="majorEastAsia" w:hAnsiTheme="minorHAnsi" w:cstheme="majorBidi"/>
@@ -2286,11 +3491,12 @@
     <w:link w:val="Title2Char"/>
     <w:autoRedefine/>
     <w:qFormat/>
-    <w:rsid w:val="00730705"/>
+    <w:rsid w:val="00DF6FA8"/>
     <w:pPr>
-      <w:bidi w:val="0"/>
+      <w:ind w:left="288" w:firstLine="0"/>
     </w:pPr>
     <w:rPr>
+      <w:color w:val="000000" w:themeColor="text1"/>
       <w:sz w:val="36"/>
     </w:rPr>
   </w:style>
@@ -2298,14 +3504,213 @@
     <w:name w:val="Title2 Char"/>
     <w:basedOn w:val="TitleChar"/>
     <w:link w:val="Title2"/>
-    <w:rsid w:val="00730705"/>
+    <w:rsid w:val="00DF6FA8"/>
     <w:rPr>
       <w:rFonts w:asciiTheme="majorBidi" w:eastAsiaTheme="majorEastAsia" w:hAnsiTheme="majorBidi" w:cstheme="majorBidi"/>
-      <w:color w:val="auto"/>
+      <w:color w:val="000000" w:themeColor="text1"/>
       <w:spacing w:val="-10"/>
       <w:kern w:val="28"/>
       <w:sz w:val="36"/>
       <w:szCs w:val="56"/>
+    </w:rPr>
+  </w:style>
+  <w:style w:type="character" w:styleId="Hyperlink">
+    <w:name w:val="Hyperlink"/>
+    <w:basedOn w:val="DefaultParagraphFont"/>
+    <w:uiPriority w:val="99"/>
+    <w:unhideWhenUsed/>
+    <w:rsid w:val="00D01B92"/>
+    <w:rPr>
+      <w:color w:val="467886" w:themeColor="hyperlink"/>
+      <w:u w:val="single"/>
+    </w:rPr>
+  </w:style>
+  <w:style w:type="character" w:styleId="UnresolvedMention">
+    <w:name w:val="Unresolved Mention"/>
+    <w:basedOn w:val="DefaultParagraphFont"/>
+    <w:uiPriority w:val="99"/>
+    <w:semiHidden/>
+    <w:unhideWhenUsed/>
+    <w:rsid w:val="00D01B92"/>
+    <w:rPr>
+      <w:color w:val="605E5C"/>
+      <w:shd w:val="clear" w:color="auto" w:fill="E1DFDD"/>
+    </w:rPr>
+  </w:style>
+  <w:style w:type="character" w:styleId="FollowedHyperlink">
+    <w:name w:val="FollowedHyperlink"/>
+    <w:basedOn w:val="DefaultParagraphFont"/>
+    <w:uiPriority w:val="99"/>
+    <w:semiHidden/>
+    <w:unhideWhenUsed/>
+    <w:rsid w:val="00095F5E"/>
+    <w:rPr>
+      <w:color w:val="96607D" w:themeColor="followedHyperlink"/>
+      <w:u w:val="single"/>
+    </w:rPr>
+  </w:style>
+  <w:style w:type="paragraph" w:styleId="TOAHeading">
+    <w:name w:val="toa heading"/>
+    <w:basedOn w:val="Normal"/>
+    <w:next w:val="Normal"/>
+    <w:uiPriority w:val="99"/>
+    <w:semiHidden/>
+    <w:unhideWhenUsed/>
+    <w:rsid w:val="00095F5E"/>
+    <w:pPr>
+      <w:spacing w:before="120"/>
+    </w:pPr>
+    <w:rPr>
+      <w:rFonts w:asciiTheme="majorHAnsi" w:eastAsiaTheme="majorEastAsia" w:hAnsiTheme="majorHAnsi" w:cstheme="majorBidi"/>
+      <w:b/>
+      <w:bCs/>
+      <w:sz w:val="24"/>
+    </w:rPr>
+  </w:style>
+  <w:style w:type="character" w:styleId="PlaceholderText">
+    <w:name w:val="Placeholder Text"/>
+    <w:basedOn w:val="DefaultParagraphFont"/>
+    <w:uiPriority w:val="99"/>
+    <w:semiHidden/>
+    <w:rsid w:val="00DF6FA8"/>
+    <w:rPr>
+      <w:color w:val="666666"/>
+    </w:rPr>
+  </w:style>
+  <w:style w:type="paragraph" w:styleId="TOCHeading">
+    <w:name w:val="TOC Heading"/>
+    <w:basedOn w:val="Heading1"/>
+    <w:next w:val="Normal"/>
+    <w:uiPriority w:val="39"/>
+    <w:unhideWhenUsed/>
+    <w:qFormat/>
+    <w:rsid w:val="00DF6FA8"/>
+    <w:pPr>
+      <w:spacing w:before="240" w:after="0" w:line="259" w:lineRule="auto"/>
+      <w:ind w:firstLine="0"/>
+      <w:outlineLvl w:val="9"/>
+    </w:pPr>
+    <w:rPr>
+      <w:kern w:val="0"/>
+      <w:sz w:val="32"/>
+      <w:szCs w:val="32"/>
+      <w14:ligatures w14:val="none"/>
+    </w:rPr>
+  </w:style>
+  <w:style w:type="paragraph" w:styleId="TOC2">
+    <w:name w:val="toc 2"/>
+    <w:basedOn w:val="Normal"/>
+    <w:next w:val="Normal"/>
+    <w:autoRedefine/>
+    <w:uiPriority w:val="39"/>
+    <w:unhideWhenUsed/>
+    <w:rsid w:val="00DF6FA8"/>
+    <w:pPr>
+      <w:spacing w:after="100" w:line="259" w:lineRule="auto"/>
+      <w:ind w:left="220" w:firstLine="0"/>
+    </w:pPr>
+    <w:rPr>
+      <w:rFonts w:asciiTheme="minorHAnsi" w:eastAsiaTheme="minorEastAsia" w:hAnsiTheme="minorHAnsi" w:cs="Times New Roman"/>
+      <w:color w:val="auto"/>
+      <w:kern w:val="0"/>
+      <w:szCs w:val="22"/>
+      <w14:ligatures w14:val="none"/>
+    </w:rPr>
+  </w:style>
+  <w:style w:type="paragraph" w:styleId="TOC1">
+    <w:name w:val="toc 1"/>
+    <w:basedOn w:val="Normal"/>
+    <w:next w:val="Normal"/>
+    <w:autoRedefine/>
+    <w:uiPriority w:val="39"/>
+    <w:unhideWhenUsed/>
+    <w:rsid w:val="00DF6FA8"/>
+    <w:pPr>
+      <w:spacing w:after="100" w:line="259" w:lineRule="auto"/>
+      <w:ind w:firstLine="0"/>
+    </w:pPr>
+    <w:rPr>
+      <w:rFonts w:asciiTheme="minorHAnsi" w:eastAsiaTheme="minorEastAsia" w:hAnsiTheme="minorHAnsi" w:cs="Times New Roman"/>
+      <w:color w:val="auto"/>
+      <w:kern w:val="0"/>
+      <w:szCs w:val="22"/>
+      <w14:ligatures w14:val="none"/>
+    </w:rPr>
+  </w:style>
+  <w:style w:type="paragraph" w:styleId="TOC3">
+    <w:name w:val="toc 3"/>
+    <w:basedOn w:val="Normal"/>
+    <w:next w:val="Normal"/>
+    <w:autoRedefine/>
+    <w:uiPriority w:val="39"/>
+    <w:unhideWhenUsed/>
+    <w:rsid w:val="00DF6FA8"/>
+    <w:pPr>
+      <w:spacing w:after="100" w:line="259" w:lineRule="auto"/>
+      <w:ind w:left="440" w:firstLine="0"/>
+    </w:pPr>
+    <w:rPr>
+      <w:rFonts w:asciiTheme="minorHAnsi" w:eastAsiaTheme="minorEastAsia" w:hAnsiTheme="minorHAnsi" w:cs="Times New Roman"/>
+      <w:color w:val="auto"/>
+      <w:kern w:val="0"/>
+      <w:szCs w:val="22"/>
+      <w14:ligatures w14:val="none"/>
+    </w:rPr>
+  </w:style>
+  <w:style w:type="paragraph" w:styleId="Header">
+    <w:name w:val="header"/>
+    <w:basedOn w:val="Normal"/>
+    <w:link w:val="HeaderChar"/>
+    <w:uiPriority w:val="99"/>
+    <w:unhideWhenUsed/>
+    <w:rsid w:val="000D1C2D"/>
+    <w:pPr>
+      <w:tabs>
+        <w:tab w:val="center" w:pos="4680"/>
+        <w:tab w:val="right" w:pos="9360"/>
+      </w:tabs>
+      <w:spacing w:after="0" w:line="240" w:lineRule="auto"/>
+    </w:pPr>
+  </w:style>
+  <w:style w:type="character" w:customStyle="1" w:styleId="HeaderChar">
+    <w:name w:val="Header Char"/>
+    <w:basedOn w:val="DefaultParagraphFont"/>
+    <w:link w:val="Header"/>
+    <w:uiPriority w:val="99"/>
+    <w:rsid w:val="000D1C2D"/>
+  </w:style>
+  <w:style w:type="paragraph" w:styleId="Footer">
+    <w:name w:val="footer"/>
+    <w:basedOn w:val="Normal"/>
+    <w:link w:val="FooterChar"/>
+    <w:uiPriority w:val="99"/>
+    <w:unhideWhenUsed/>
+    <w:rsid w:val="000D1C2D"/>
+    <w:pPr>
+      <w:tabs>
+        <w:tab w:val="center" w:pos="4680"/>
+        <w:tab w:val="right" w:pos="9360"/>
+      </w:tabs>
+      <w:spacing w:after="0" w:line="240" w:lineRule="auto"/>
+    </w:pPr>
+  </w:style>
+  <w:style w:type="character" w:customStyle="1" w:styleId="FooterChar">
+    <w:name w:val="Footer Char"/>
+    <w:basedOn w:val="DefaultParagraphFont"/>
+    <w:link w:val="Footer"/>
+    <w:uiPriority w:val="99"/>
+    <w:rsid w:val="000D1C2D"/>
+  </w:style>
+  <w:style w:type="paragraph" w:styleId="NormalWeb">
+    <w:name w:val="Normal (Web)"/>
+    <w:basedOn w:val="Normal"/>
+    <w:uiPriority w:val="99"/>
+    <w:semiHidden/>
+    <w:unhideWhenUsed/>
+    <w:rsid w:val="00815E64"/>
+    <w:rPr>
+      <w:rFonts w:cs="Times New Roman"/>
+      <w:sz w:val="24"/>
     </w:rPr>
   </w:style>
 </w:styles>
@@ -2604,4 +4009,41 @@
     </a:ext>
   </a:extLst>
 </a:theme>
+</file>
+
+<file path=word/webextensions/taskpanes.xml><?xml version="1.0" encoding="utf-8"?>
+<wetp:taskpanes xmlns:wetp="http://schemas.microsoft.com/office/webextensions/taskpanes/2010/11">
+  <wetp:taskpane dockstate="right" visibility="0" width="350" row="0">
+    <wetp:webextensionref xmlns:r="http://schemas.openxmlformats.org/officeDocument/2006/relationships" r:id="rId1"/>
+  </wetp:taskpane>
+</wetp:taskpanes>
+</file>
+
+<file path=word/webextensions/webextension1.xml><?xml version="1.0" encoding="utf-8"?>
+<we:webextension xmlns:we="http://schemas.microsoft.com/office/webextensions/webextension/2010/11" id="{3ED0AE96-0D54-4638-A1E0-A2AEEA2073D0}">
+  <we:reference id="wa104382081" version="1.55.1.0" store="en-US" storeType="OMEX"/>
+  <we:alternateReferences>
+    <we:reference id="WA104382081" version="1.55.1.0" store="" storeType="OMEX"/>
+  </we:alternateReferences>
+  <we:properties>
+    <we:property name="MENDELEY_BIBLIOGRAPHY_IS_DIRTY" value="false"/>
+    <we:property name="MENDELEY_BIBLIOGRAPHY_LAST_MODIFIED" value="1783847829193"/>
+    <we:property name="MENDELEY_CITATIONS" value="[]"/>
+    <we:property name="MENDELEY_CITATIONS_STYLE" value="{&quot;id&quot;:&quot;https://www.zotero.org/styles/apa&quot;,&quot;title&quot;:&quot;APA Style 7th edition&quot;,&quot;format&quot;:&quot;author-date&quot;,&quot;defaultLocale&quot;:null,&quot;isLocaleCodeValid&quot;:true}"/>
+  </we:properties>
+  <we:bindings/>
+  <we:snapshot xmlns:r="http://schemas.openxmlformats.org/officeDocument/2006/relationships"/>
+</we:webextension>
+</file>
+
+<file path=customXml/item1.xml><?xml version="1.0" encoding="utf-8"?>
+<b:Sources xmlns:b="http://schemas.openxmlformats.org/officeDocument/2006/bibliography" xmlns="http://schemas.openxmlformats.org/officeDocument/2006/bibliography" SelectedStyle="\CHICAGO.XSL" StyleName="Chicago" Version="16"/>
+</file>
+
+<file path=customXml/itemProps1.xml><?xml version="1.0" encoding="utf-8"?>
+<ds:datastoreItem xmlns:ds="http://schemas.openxmlformats.org/officeDocument/2006/customXml" ds:itemID="{262D8892-C3CC-44D4-82F7-83728DE62B1B}">
+  <ds:schemaRefs>
+    <ds:schemaRef ds:uri="http://schemas.openxmlformats.org/officeDocument/2006/bibliography"/>
+  </ds:schemaRefs>
+</ds:datastoreItem>
 </file>
</xml_diff>

<commit_message>
imbodyment of the research phase1
</commit_message>
<xml_diff>
--- a/Proposal/Japan_At_Inflection_points.docx
+++ b/Proposal/Japan_At_Inflection_points.docx
@@ -54,7 +54,7 @@
           <w:sz w:val="44"/>
           <w:szCs w:val="56"/>
         </w:rPr>
-        <w:t>"Strategic Adaptation and Policy Synergies: Business Leadership at Japan's Post-War Economic Inflection Points"</w:t>
+        <w:t>"Strategic Adaptation and Policy Synergies: Business Leadership at Japan's Economic Inflection Points"</w:t>
       </w:r>
     </w:p>
     <w:p>
@@ -99,7 +99,7 @@
       <w:pPr>
         <w:pStyle w:val="Title2"/>
       </w:pPr>
-      <w:bookmarkStart w:id="1" w:name="_Toc234763681"/>
+      <w:bookmarkStart w:id="1" w:name="_Toc234854327"/>
       <w:r>
         <w:t>Abst</w:t>
       </w:r>
@@ -384,7 +384,7 @@
           <w:r>
             <w:fldChar w:fldCharType="separate"/>
           </w:r>
-          <w:hyperlink w:anchor="_Toc234763681" w:history="1">
+          <w:hyperlink w:anchor="_Toc234854327" w:history="1">
             <w:r>
               <w:rPr>
                 <w:rStyle w:val="Hyperlink"/>
@@ -411,7 +411,7 @@
                 <w:noProof/>
                 <w:webHidden/>
               </w:rPr>
-              <w:instrText xml:space="preserve"> PAGEREF _Toc234763681 \h </w:instrText>
+              <w:instrText xml:space="preserve"> PAGEREF _Toc234854327 \h </w:instrText>
             </w:r>
             <w:r>
               <w:rPr>
@@ -457,27 +457,13 @@
               <w14:ligatures w14:val="standardContextual"/>
             </w:rPr>
           </w:pPr>
-          <w:hyperlink w:anchor="_Toc234763682" w:history="1">
+          <w:hyperlink w:anchor="_Toc234854328" w:history="1">
             <w:r>
               <w:rPr>
                 <w:rStyle w:val="Hyperlink"/>
                 <w:noProof/>
               </w:rPr>
-              <w:t xml:space="preserve">Literature </w:t>
-            </w:r>
-            <w:r>
-              <w:rPr>
-                <w:rStyle w:val="Hyperlink"/>
-                <w:noProof/>
-              </w:rPr>
-              <w:t>R</w:t>
-            </w:r>
-            <w:r>
-              <w:rPr>
-                <w:rStyle w:val="Hyperlink"/>
-                <w:noProof/>
-              </w:rPr>
-              <w:t>eview</w:t>
+              <w:t>Literature Review</w:t>
             </w:r>
             <w:r>
               <w:rPr>
@@ -498,7 +484,7 @@
                 <w:noProof/>
                 <w:webHidden/>
               </w:rPr>
-              <w:instrText xml:space="preserve"> PAGEREF _Toc234763682 \h </w:instrText>
+              <w:instrText xml:space="preserve"> PAGEREF _Toc234854328 \h </w:instrText>
             </w:r>
             <w:r>
               <w:rPr>
@@ -544,13 +530,13 @@
               <w14:ligatures w14:val="standardContextual"/>
             </w:rPr>
           </w:pPr>
-          <w:hyperlink w:anchor="_Toc234763683" w:history="1">
+          <w:hyperlink w:anchor="_Toc234854329" w:history="1">
             <w:r>
               <w:rPr>
                 <w:rStyle w:val="Hyperlink"/>
                 <w:noProof/>
               </w:rPr>
-              <w:t>References</w:t>
+              <w:t>Inflection points</w:t>
             </w:r>
             <w:r>
               <w:rPr>
@@ -571,7 +557,7 @@
                 <w:noProof/>
                 <w:webHidden/>
               </w:rPr>
-              <w:instrText xml:space="preserve"> PAGEREF _Toc234763683 \h </w:instrText>
+              <w:instrText xml:space="preserve"> PAGEREF _Toc234854329 \h </w:instrText>
             </w:r>
             <w:r>
               <w:rPr>
@@ -591,7 +577,80 @@
                 <w:noProof/>
                 <w:webHidden/>
               </w:rPr>
-              <w:t>9</w:t>
+              <w:t>7</w:t>
+            </w:r>
+            <w:r>
+              <w:rPr>
+                <w:noProof/>
+                <w:webHidden/>
+              </w:rPr>
+              <w:fldChar w:fldCharType="end"/>
+            </w:r>
+          </w:hyperlink>
+        </w:p>
+        <w:p>
+          <w:pPr>
+            <w:pStyle w:val="TOC1"/>
+            <w:tabs>
+              <w:tab w:val="right" w:leader="dot" w:pos="9736"/>
+            </w:tabs>
+            <w:rPr>
+              <w:rFonts w:cstheme="minorBidi"/>
+              <w:noProof/>
+              <w:kern w:val="2"/>
+              <w:sz w:val="24"/>
+              <w:szCs w:val="24"/>
+              <w14:ligatures w14:val="standardContextual"/>
+            </w:rPr>
+          </w:pPr>
+          <w:hyperlink w:anchor="_Toc234854330" w:history="1">
+            <w:r>
+              <w:rPr>
+                <w:rStyle w:val="Hyperlink"/>
+                <w:noProof/>
+              </w:rPr>
+              <w:t>References</w:t>
+            </w:r>
+            <w:r>
+              <w:rPr>
+                <w:noProof/>
+                <w:webHidden/>
+              </w:rPr>
+              <w:tab/>
+            </w:r>
+            <w:r>
+              <w:rPr>
+                <w:noProof/>
+                <w:webHidden/>
+              </w:rPr>
+              <w:fldChar w:fldCharType="begin"/>
+            </w:r>
+            <w:r>
+              <w:rPr>
+                <w:noProof/>
+                <w:webHidden/>
+              </w:rPr>
+              <w:instrText xml:space="preserve"> PAGEREF _Toc234854330 \h </w:instrText>
+            </w:r>
+            <w:r>
+              <w:rPr>
+                <w:noProof/>
+                <w:webHidden/>
+              </w:rPr>
+            </w:r>
+            <w:r>
+              <w:rPr>
+                <w:noProof/>
+                <w:webHidden/>
+              </w:rPr>
+              <w:fldChar w:fldCharType="separate"/>
+            </w:r>
+            <w:r>
+              <w:rPr>
+                <w:noProof/>
+                <w:webHidden/>
+              </w:rPr>
+              <w:t>16</w:t>
             </w:r>
             <w:r>
               <w:rPr>
@@ -665,7 +724,7 @@
         <w:pStyle w:val="Title2"/>
         <w:ind w:left="0"/>
       </w:pPr>
-      <w:bookmarkStart w:id="2" w:name="_Toc234763682"/>
+      <w:bookmarkStart w:id="2" w:name="_Toc234854328"/>
       <w:r>
         <w:t>Literature Review</w:t>
       </w:r>
@@ -1281,17 +1340,998 @@
       </w:r>
     </w:p>
     <w:p>
+      <w:pPr>
+        <w:pStyle w:val="Title2"/>
+        <w:ind w:left="0"/>
+      </w:pPr>
+      <w:bookmarkStart w:id="3" w:name="_Toc234854329"/>
       <w:r>
         <w:lastRenderedPageBreak/>
-        <w:t>Global picture of Japan’s markets and industries</w:t>
-      </w:r>
+        <w:t>Inflection points</w:t>
+      </w:r>
+      <w:bookmarkEnd w:id="3"/>
     </w:p>
     <w:p/>
     <w:p>
+      <w:pPr>
+        <w:jc w:val="both"/>
+      </w:pPr>
+      <w:r>
+        <w:t>Before the study of the businesses reactions towards economic movements starts, we need first to realize what inflection point are, and which of those is the most definitive one to start with. Inflection points in mathematics refers to a point when the second derivative of a function shifts sign. Signaling the transition from a concave</w:t>
+      </w:r>
+      <w:r>
+        <w:t xml:space="preserve"> to convex curve or vice versa. In an easy word, the dynamics of the growth rate changes within an inflection point. On the other hand, in economic analysis, an inflection point refers to a critical juncture where the trajectory of key indexes (in an economy) goes through a markable change in direction. In studies of development and business cycles, inflection points denote periods of dramatic changes via exogenous shocks, policy interventions, or endogenous adaptations. Mainly characterized by high uncertainty, realignment of institutional frameworks, and changes in economic agent’s decision-making. In this study, we will be having a notice on the </w:t>
+      </w:r>
+      <w:r>
+        <w:t>household economics b</w:t>
+      </w:r>
+      <w:r>
+        <w:t>y</w:t>
+      </w:r>
+      <w:r>
+        <w:t xml:space="preserve"> the</w:t>
+      </w:r>
+      <w:r>
+        <w:t xml:space="preserve"> unemployment r</w:t>
+      </w:r>
+      <w:r>
+        <w:t>ate, and CPI inflation rate</w:t>
+      </w:r>
+      <w:r>
+        <w:t xml:space="preserve"> (from now on, we will refer to this by CPI</w:t>
+      </w:r>
+      <w:proofErr w:type="gramStart"/>
+      <w:r>
+        <w:t xml:space="preserve">) </w:t>
+      </w:r>
+      <w:r>
+        <w:t>.</w:t>
+      </w:r>
+      <w:proofErr w:type="gramEnd"/>
+      <w:r>
+        <w:t xml:space="preserve"> For the industrial section, we will be relying on the trade balance, deposit interest rates, GDP growth rates. </w:t>
+      </w:r>
+    </w:p>
+    <w:p>
+      <w:pPr>
+        <w:spacing w:line="276" w:lineRule="auto"/>
+        <w:jc w:val="both"/>
+      </w:pPr>
+      <w:r>
+        <w:t xml:space="preserve">Although household economy is not amongst the concerns of the subject, but it is a vital economic factor to have in mind. Study of an economy </w:t>
+      </w:r>
+      <w:r>
+        <w:t>is distinctly complex for its integrated nature. The model that we are trying to simplify Japan’s economy in, can’t have the households, the work force, out of the equation. By studying the patterns of unemployment rate and CPI, we can have insights about their actions via a filter that will be decent through this study.</w:t>
+      </w:r>
+      <w:r>
+        <w:t xml:space="preserve"> In an economy with a raising unemployment rate, we will be expecting the household expenditure, and savings to decrease. Furthermore, this</w:t>
+      </w:r>
+      <w:r>
+        <w:t xml:space="preserve"> proxy </w:t>
+      </w:r>
+      <w:r>
+        <w:t xml:space="preserve">leads us to revenue expectations of businesses, and the wage expectations for the workforce. So, as sophisticated as it seems, we need also to pay attention to the household factors as well as the industry factors. </w:t>
+      </w:r>
+    </w:p>
+    <w:p>
+      <w:pPr>
+        <w:spacing w:line="276" w:lineRule="auto"/>
+        <w:jc w:val="both"/>
+      </w:pPr>
+      <w:r>
+        <w:t xml:space="preserve">For the industrial section, we will rely primarily on core indicators such as trade balance, deposit interest rates, and GDP growth rates to capture </w:t>
+      </w:r>
+      <w:r>
+        <w:t>a firm picture</w:t>
+      </w:r>
+      <w:r>
+        <w:t xml:space="preserve"> of business adaptation and policy effectiveness. These metrics serve as direct lenses into how firms navigated uncertainty, reallocating resources and leveraging institutional support at key </w:t>
+      </w:r>
+      <w:r>
+        <w:t>stroke-points</w:t>
+      </w:r>
+      <w:r>
+        <w:t>. A favorable trade balance, for instance, reflects successful export strategies and supply-chain coordination within keiretsu networks, often amplified by policies like undervalued currency regimes or MITI-directed investments in heavy industries. Deposit interest rates, shaped by financial repression and Bank of Japan</w:t>
+      </w:r>
+      <w:r>
+        <w:t xml:space="preserve"> (we will refer to as BoJ)</w:t>
+      </w:r>
+      <w:r>
+        <w:t xml:space="preserve"> interventions, influenced capital availability, enabling long-term planning and risk-sharing that distinguished Japanese business actions from short-term shareholder pressures in Western models. Meanwhile, fluctuations in GDP growth rates mark the aggregate outcomes of these efforts</w:t>
+      </w:r>
+      <w:r>
+        <w:t xml:space="preserve"> </w:t>
+      </w:r>
+      <w:r>
+        <w:t>from the explosive double-digit expansions during the miracle era, driven by technology imports and capacity building, to the moderated trajectories post-Nixon Shock, where firms responded with productivity enhancements and overseas diversification. By examining these industrial variables alongside business leaders' strategic responses, such as just-in-time production and quality-focused innovation, we gain a clearer understanding of how policy synergies translated into tangible economic results, including sectoral upgrading and global competitiveness, while also revealing embedded rigidities that later constrained adaptability</w:t>
+      </w:r>
+      <w:r>
+        <w:t>.</w:t>
+      </w:r>
+    </w:p>
+    <w:p>
+      <w:pPr>
+        <w:spacing w:before="240" w:line="276" w:lineRule="auto"/>
+        <w:jc w:val="both"/>
+      </w:pPr>
+      <w:r>
+        <w:t>Japan’s post-war</w:t>
+      </w:r>
+      <w:r>
+        <w:t xml:space="preserve"> economic history </w:t>
+      </w:r>
+      <w:r>
+        <w:t>shows</w:t>
+      </w:r>
+      <w:r>
+        <w:t xml:space="preserve"> several well-documented inflection points, identified through breaks in growth trends, policy regime changes, and structural transformations. </w:t>
+      </w:r>
+      <w:r>
+        <w:t>However, only four to maximum of six</w:t>
+      </w:r>
+      <w:r>
+        <w:t>,</w:t>
+      </w:r>
+      <w:r>
+        <w:t xml:space="preserve"> between </w:t>
+      </w:r>
+      <w:r>
+        <w:t xml:space="preserve">years </w:t>
+      </w:r>
+      <w:r>
+        <w:t>1945 and 2011</w:t>
+      </w:r>
+      <w:r>
+        <w:t>,</w:t>
+      </w:r>
+      <w:r>
+        <w:t xml:space="preserve"> are regarded as “inflection point” through the economic history of Japan. </w:t>
+      </w:r>
+      <w:r>
+        <w:t>These are not arbitrary</w:t>
+      </w:r>
+      <w:r>
+        <w:t>,</w:t>
+      </w:r>
+      <w:r>
+        <w:t xml:space="preserve"> but tied to observable discontinuities in data</w:t>
+      </w:r>
+      <w:r>
+        <w:t>.</w:t>
+      </w:r>
+      <w:r>
+        <w:t xml:space="preserve"> </w:t>
+      </w:r>
+      <w:r>
+        <w:t xml:space="preserve">Let’s start the series by Japan right after the war. </w:t>
+      </w:r>
+    </w:p>
+    <w:p>
+      <w:pPr>
+        <w:spacing w:before="240" w:line="276" w:lineRule="auto"/>
+        <w:jc w:val="both"/>
+      </w:pPr>
+    </w:p>
+    <w:p>
+      <w:pPr>
+        <w:pStyle w:val="Subtitle"/>
+        <w:jc w:val="both"/>
+      </w:pPr>
+      <w:r>
+        <w:lastRenderedPageBreak/>
+        <w:t>Immediate postwar (1945-1950)</w:t>
+      </w:r>
+    </w:p>
+    <w:p>
+      <w:pPr>
+        <w:spacing w:line="276" w:lineRule="auto"/>
+        <w:jc w:val="both"/>
+        <w:rPr>
+          <w:lang w:bidi="fa-IR"/>
+        </w:rPr>
+      </w:pPr>
+      <w:r>
+        <w:rPr>
+          <w:lang w:bidi="fa-IR"/>
+        </w:rPr>
+        <w:t xml:space="preserve">The immediate postwar period represented Japan’s most </w:t>
+      </w:r>
+      <w:r>
+        <w:rPr>
+          <w:lang w:bidi="fa-IR"/>
+        </w:rPr>
+        <w:t>remarkable</w:t>
+      </w:r>
+      <w:r>
+        <w:rPr>
+          <w:lang w:bidi="fa-IR"/>
+        </w:rPr>
+        <w:t xml:space="preserve"> economic inflection, transitioning from wartime collapse to institutional foundations for recovery. Industrial output plummeted </w:t>
+      </w:r>
+      <w:r>
+        <w:rPr>
+          <w:lang w:bidi="fa-IR"/>
+        </w:rPr>
+        <w:t>to</w:t>
+      </w:r>
+      <w:r>
+        <w:rPr>
+          <w:lang w:bidi="fa-IR"/>
+        </w:rPr>
+        <w:t xml:space="preserve"> prewar levels amid widespread destruction, hyperinflation, and supply shortages. Business leaders faced existential challenges</w:t>
+      </w:r>
+      <w:r>
+        <w:rPr>
+          <w:lang w:bidi="fa-IR"/>
+        </w:rPr>
+        <w:t xml:space="preserve">. Having the Zaibatsu conglomerates </w:t>
+      </w:r>
+      <w:r>
+        <w:rPr>
+          <w:lang w:bidi="fa-IR"/>
+        </w:rPr>
+        <w:t>dismantled</w:t>
+      </w:r>
+      <w:r>
+        <w:rPr>
+          <w:lang w:bidi="fa-IR"/>
+        </w:rPr>
+        <w:t xml:space="preserve">. To which, </w:t>
+      </w:r>
+      <w:r>
+        <w:rPr>
+          <w:lang w:bidi="fa-IR"/>
+        </w:rPr>
+        <w:t>adaptation from family-controlled empires to more decentralized structures</w:t>
+      </w:r>
+      <w:r>
+        <w:rPr>
+          <w:lang w:bidi="fa-IR"/>
+        </w:rPr>
+        <w:t xml:space="preserve"> was inevitable</w:t>
+      </w:r>
+      <w:r>
+        <w:rPr>
+          <w:lang w:bidi="fa-IR"/>
+        </w:rPr>
+        <w:t>. Key figures like those in the emerging professional managerial class</w:t>
+      </w:r>
+      <w:r>
+        <w:rPr>
+          <w:lang w:bidi="fa-IR"/>
+        </w:rPr>
+        <w:t xml:space="preserve">, </w:t>
+      </w:r>
+      <w:r>
+        <w:rPr>
+          <w:lang w:bidi="fa-IR"/>
+        </w:rPr>
+        <w:t xml:space="preserve">drawing from prewar political </w:t>
+      </w:r>
+      <w:r>
+        <w:rPr>
+          <w:lang w:bidi="fa-IR"/>
+        </w:rPr>
+        <w:t>merchant’s</w:t>
+      </w:r>
+      <w:r>
+        <w:rPr>
+          <w:lang w:bidi="fa-IR"/>
+        </w:rPr>
+        <w:t xml:space="preserve"> networks</w:t>
+      </w:r>
+      <w:r>
+        <w:rPr>
+          <w:lang w:bidi="fa-IR"/>
+        </w:rPr>
+        <w:t xml:space="preserve">, </w:t>
+      </w:r>
+      <w:r>
+        <w:rPr>
+          <w:lang w:bidi="fa-IR"/>
+        </w:rPr>
+        <w:t>played pivotal roles in reorganization. While families such as the Mitsui and Mitsubishi lost direct control due to SCAP</w:t>
+      </w:r>
+      <w:r>
+        <w:rPr>
+          <w:lang w:bidi="fa-IR"/>
+        </w:rPr>
+        <w:t xml:space="preserve"> </w:t>
+      </w:r>
+      <w:r>
+        <w:rPr>
+          <w:lang w:bidi="fa-IR"/>
+        </w:rPr>
+        <w:t xml:space="preserve">purges and asset liquidations, surviving </w:t>
+      </w:r>
+      <w:r>
+        <w:rPr>
+          <w:lang w:bidi="fa-IR"/>
+        </w:rPr>
+        <w:t>families tried to preserve their businesses, using their relational ties.</w:t>
+      </w:r>
+    </w:p>
+    <w:p>
+      <w:pPr>
+        <w:spacing w:line="276" w:lineRule="auto"/>
+        <w:jc w:val="both"/>
+        <w:rPr>
+          <w:lang w:bidi="fa-IR"/>
+        </w:rPr>
+      </w:pPr>
+      <w:r>
+        <w:rPr>
+          <w:lang w:bidi="fa-IR"/>
+        </w:rPr>
+        <w:t>SCAP policies under General Douglas MacArthur were transformative. Antitrust reforms (1945–1952) mandated zaibats</w:t>
+      </w:r>
+      <w:r>
+        <w:rPr>
+          <w:lang w:bidi="fa-IR"/>
+        </w:rPr>
+        <w:t xml:space="preserve">u dissolution. </w:t>
+      </w:r>
+      <w:r>
+        <w:rPr>
+          <w:lang w:bidi="fa-IR"/>
+        </w:rPr>
+        <w:t xml:space="preserve"> holding companies banned, cross-holdings dismantled, and family assets liquidated to democratize the economy and prevent militarism. Complementary measures included land reform, which redistributed holdings to farmers, broadening the domestic market and stabilizing rural consumption, alongside labor democratization that empowered union</w:t>
+      </w:r>
+      <w:r>
+        <w:rPr>
+          <w:lang w:bidi="fa-IR"/>
+        </w:rPr>
+        <w:t>s</w:t>
+      </w:r>
+      <w:r>
+        <w:rPr>
+          <w:lang w:bidi="fa-IR"/>
+        </w:rPr>
+        <w:t xml:space="preserve">. The Dodge Line (1949), implemented by American banker Joseph Dodge, enforced fiscal austerity, fixed the exchange rate at ¥360 per USD, and </w:t>
+      </w:r>
+      <w:r>
+        <w:rPr>
+          <w:lang w:bidi="fa-IR"/>
+        </w:rPr>
+        <w:t>controlled</w:t>
+      </w:r>
+      <w:r>
+        <w:rPr>
+          <w:lang w:bidi="fa-IR"/>
+        </w:rPr>
+        <w:t xml:space="preserve"> inflation</w:t>
+      </w:r>
+      <w:r>
+        <w:rPr>
+          <w:lang w:bidi="fa-IR"/>
+        </w:rPr>
+        <w:t xml:space="preserve">, </w:t>
+      </w:r>
+      <w:r>
+        <w:rPr>
+          <w:lang w:bidi="fa-IR"/>
+        </w:rPr>
+        <w:t>creating a stable platform for business planning</w:t>
+      </w:r>
+      <w:sdt>
+        <w:sdtPr>
+          <w:rPr>
+            <w:rFonts w:cs="Times New Roman"/>
+            <w:color w:val="262626"/>
+            <w:lang w:bidi="fa-IR"/>
+          </w:rPr>
+          <w:tag w:val="MENDELEY_CITATION_v3_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"/>
+          <w:id w:val="-1811317844"/>
+          <w:placeholder>
+            <w:docPart w:val="DefaultPlaceholder_-1854013440"/>
+          </w:placeholder>
+        </w:sdtPr>
+        <w:sdtContent>
+          <w:r>
+            <w:rPr>
+              <w:rFonts w:cs="Times New Roman"/>
+              <w:color w:val="262626"/>
+              <w:lang w:bidi="fa-IR"/>
+            </w:rPr>
+            <w:t xml:space="preserve"> </w:t>
+          </w:r>
+          <w:r>
+            <w:rPr>
+              <w:rFonts w:cs="Times New Roman"/>
+              <w:color w:val="262626"/>
+              <w:lang w:bidi="fa-IR"/>
+            </w:rPr>
+            <w:t>(Takada, 1999)</w:t>
+          </w:r>
+        </w:sdtContent>
+      </w:sdt>
+      <w:r>
+        <w:rPr>
+          <w:lang w:bidi="fa-IR"/>
+        </w:rPr>
+        <w:t>.</w:t>
+      </w:r>
+    </w:p>
+    <w:p>
+      <w:pPr>
+        <w:spacing w:line="276" w:lineRule="auto"/>
+        <w:jc w:val="both"/>
+        <w:rPr>
+          <w:lang w:bidi="fa-IR"/>
+        </w:rPr>
+      </w:pPr>
+      <w:r>
+        <w:rPr>
+          <w:lang w:bidi="fa-IR"/>
+        </w:rPr>
+        <w:t xml:space="preserve">Industry reactions centered on </w:t>
+      </w:r>
+      <w:r>
+        <w:rPr>
+          <w:lang w:bidi="fa-IR"/>
+        </w:rPr>
+        <w:t>“Rebuilding Japan”</w:t>
+      </w:r>
+      <w:r>
+        <w:rPr>
+          <w:lang w:bidi="fa-IR"/>
+        </w:rPr>
+        <w:t xml:space="preserve">. Former zaibatsu affiliates re-formed into bank-centered keiretsu, emphasizing relational contracting and main-bank financing for risk-sharing. Business owners prioritized reconstruction in basics like coal, steel, and electric power, channeling limited resources into capacity rebuilding. This period laid groundwork for professional management over familial control, </w:t>
+      </w:r>
+      <w:r>
+        <w:rPr>
+          <w:lang w:bidi="fa-IR"/>
+        </w:rPr>
+        <w:t>enforcing</w:t>
+      </w:r>
+      <w:r>
+        <w:rPr>
+          <w:lang w:bidi="fa-IR"/>
+        </w:rPr>
+        <w:t xml:space="preserve"> adaptability. Outcomes proved largely positive: by 1952, prewar industrial levels were regained, a skilled workforce emerged, and broader market access supported subsequent export-led strategies</w:t>
+      </w:r>
+      <w:r>
+        <w:rPr>
+          <w:lang w:bidi="fa-IR"/>
+        </w:rPr>
+        <w:t xml:space="preserve"> which led to a better roadway to growth </w:t>
+      </w:r>
+      <w:sdt>
+        <w:sdtPr>
+          <w:rPr>
+            <w:rFonts w:cs="Times New Roman"/>
+            <w:color w:val="262626"/>
+            <w:lang w:bidi="fa-IR"/>
+          </w:rPr>
+          <w:tag w:val="MENDELEY_CITATION_v3_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"/>
+          <w:id w:val="291564683"/>
+          <w:placeholder>
+            <w:docPart w:val="DefaultPlaceholder_-1854013440"/>
+          </w:placeholder>
+        </w:sdtPr>
+        <w:sdtContent>
+          <w:r>
+            <w:rPr>
+              <w:rFonts w:cs="Times New Roman"/>
+              <w:color w:val="262626"/>
+              <w:lang w:bidi="fa-IR"/>
+            </w:rPr>
+            <w:t>(Takada, 1999)</w:t>
+          </w:r>
+        </w:sdtContent>
+      </w:sdt>
+      <w:r>
+        <w:rPr>
+          <w:lang w:bidi="fa-IR"/>
+        </w:rPr>
+        <w:t xml:space="preserve">. </w:t>
+      </w:r>
+    </w:p>
+    <w:p>
+      <w:pPr>
+        <w:spacing w:line="276" w:lineRule="auto"/>
+        <w:rPr>
+          <w:lang w:bidi="fa-IR"/>
+        </w:rPr>
+      </w:pPr>
+      <w:r>
+        <w:rPr>
+          <w:lang w:bidi="fa-IR"/>
+        </w:rPr>
+        <w:t>1950–1953: Korean War Boom – Demand Surge as External Catalyst</w:t>
+      </w:r>
+    </w:p>
+    <w:p>
+      <w:pPr>
+        <w:spacing w:line="276" w:lineRule="auto"/>
+        <w:rPr>
+          <w:lang w:bidi="fa-IR"/>
+        </w:rPr>
+      </w:pPr>
+      <w:r>
+        <w:rPr>
+          <w:lang w:bidi="fa-IR"/>
+        </w:rPr>
+        <w:t>The Korean War marked a sharp positive inflection, injecting exogenous demand that accelerated recovery. Special procurements by UN forces provided critical foreign exchange and orders, acting as a catalyst when domestic markets remained fragile. Business leaders capitalized aggressively: executives in heavy industries and trading firms (precursors to sogo shosha) redirected efforts toward fulfilling military-related contracts in textiles, metals, and machinery. Figures associated with re-emerging groups, such as Toyota’s leadership in vertical integration, exemplified supply-chain tightening to meet surged demand.</w:t>
+      </w:r>
+    </w:p>
+    <w:p>
+      <w:pPr>
+        <w:spacing w:line="276" w:lineRule="auto"/>
+        <w:rPr>
+          <w:lang w:bidi="fa-IR"/>
+        </w:rPr>
+      </w:pPr>
+      <w:r>
+        <w:rPr>
+          <w:lang w:bidi="fa-IR"/>
+        </w:rPr>
+        <w:t>Policies reinforced this momentum. The U.S.-Japan Security Treaty (1951, revised 1960) reduced defense burdens, freeing capital for industrial investment. Occupation authorities shifted toward economic rehabilitation in the “Reverse Course,” relaxing some earlier reforms to prioritize stability amid Cold War priorities. MITI’s early guidance began shaping priorities toward capital-intensive sectors.</w:t>
+      </w:r>
+    </w:p>
+    <w:p>
+      <w:pPr>
+        <w:spacing w:line="276" w:lineRule="auto"/>
+        <w:jc w:val="both"/>
+        <w:rPr>
+          <w:rFonts w:hint="cs"/>
+          <w:rtl/>
+          <w:lang w:bidi="fa-IR"/>
+        </w:rPr>
+      </w:pPr>
+      <w:r>
+        <w:rPr>
+          <w:lang w:bidi="fa-IR"/>
+        </w:rPr>
+        <w:t>Industry reactions involved rapid scaling: firms invested in imported technology and expanded capacity, leveraging Korean War windfalls for modernization. This external boost enabled technology imports and inventory buildup, smoothing the transition to peacetime production. Outcomes included accelerated GDP recovery, strengthened export capabilities, and confidence in coordinated capitalism. Business adaptation here highlighted pragmatism—converting geopolitical events into domestic industrial foundations—while policies provided the enabling security and financial environment. By 1953, Japan was poised for sustained high growth, closing gaps with Western economies.</w:t>
+      </w:r>
+    </w:p>
+    <w:p>
+      <w:pPr>
+        <w:jc w:val="both"/>
+      </w:pPr>
+    </w:p>
+    <w:p>
+      <w:pPr>
+        <w:jc w:val="both"/>
+      </w:pPr>
+    </w:p>
+    <w:p>
+      <w:pPr>
+        <w:jc w:val="both"/>
+      </w:pPr>
+    </w:p>
+    <w:p>
+      <w:pPr>
+        <w:jc w:val="both"/>
+      </w:pPr>
+      <w:r>
+        <w:t>The most pivotal were the immediate postwar reconstruction (1945–1952), the high-growth consolidation (mid-1950s–early 1970s), and the external shocks of the early 1970s. These stand out for their profound impact on business strategies, policy innovation, and long-term outcomes.</w:t>
+      </w:r>
+    </w:p>
+    <w:p>
+      <w:pPr>
+        <w:jc w:val="both"/>
+      </w:pPr>
+      <w:r>
+        <w:t>1. Postwar Occupation and Zaibatsu Dissolution (1945–1952): Defeat left Japan’s economy in ruins—industrial output at ~30% of prewar levels, hyperinflation, and supply shortages. SCAP (Supreme Commander for the Allied Powers) reforms marked a foundational inflection. Antitrust measures dissolved family-controlled zaibatsu conglomerates (e.g., Mitsui, Mitsubishi), banning holding companies and liquidating assets to democratize economic power and curb militarism. Business leaders adapted by reorganizing into looser, bank-centered keiretsu networks with cross-shareholding and relational contracting. Complementary policies included land reform (redistributing to tenants, boosting rural demand and stability) and labor democratization (union rights, though moderated later).</w:t>
+      </w:r>
+    </w:p>
+    <w:p>
+      <w:pPr>
+        <w:jc w:val="both"/>
+      </w:pPr>
+      <w:r>
+        <w:t>Outcomes were transformative: freed from familial control, professional managers pursued aggressive investment and technology adoption. Supported by U.S. aid and MITI precursors, this laid groundwork for export orientation. Business actions—diversification into heavy industries and supply-chain integration—yielded rapid recovery, though incomplete dissolution preserved informal networks that later enabled coordinated growth while sowing bank-centric vulnerabilities.</w:t>
+      </w:r>
+    </w:p>
+    <w:p>
+      <w:pPr>
+        <w:jc w:val="both"/>
+      </w:pPr>
+      <w:r>
+        <w:t>2. Korean War Procurements and High-Growth Takeoff (1950–1973): The Korean War provided an exogenous demand shock ("special procurements" injecting foreign exchange), accelerating recovery. This period crystallized the "economic miracle," with real GDP growth averaging ~9–10% annually. Business owners in emerging keiretsu (horizontal like Mitsui/Mitsubishi; vertical like Toyota) leveraged stable capital via main banks, information sharing through sogo shosha, and long-term contracting for just-in-time efficiency. Strategies emphasized scale, quality (Deming-inspired), and heavy/chemical industry prioritization per MITI guidance.</w:t>
+      </w:r>
+    </w:p>
+    <w:p>
+      <w:pPr>
+        <w:jc w:val="both"/>
+      </w:pPr>
+      <w:r>
+        <w:t>Policies were synergistic: the 1960 Income Doubling Plan offered indicative planning; financial repression (low rates, directed credit) and undervalued yen (¥360/USD under Bretton Woods) fueled capital deepening and exports. High savings, education expansion, and U.S. alliance (security treaty reducing defense burdens) amplified effects. Outcomes: technological leapfrogging, export competitiveness (textiles → machinery → autos/electronics), and Japan’s rise as the world’s second-largest economy by the late 1960s. However, embedded rigidities (lifetime employment, over-investment norms) foreshadowed later strains.</w:t>
+      </w:r>
+    </w:p>
+    <w:p>
+      <w:pPr>
+        <w:jc w:val="both"/>
+      </w:pPr>
+      <w:r>
+        <w:t>3. 1971 Nixon Shock, Oil Crises, and Structural Adjustment (1970s onward): The collapse of Bretton Woods forced yen appreciation, compounded by 1973/1979 oil shocks. This inflection tested adaptability. Firms responded by enhancing productivity, relocating production overseas, diversifying into high-value sectors, and unwinding some cross-holdings. Policies shifted toward floating rates, fiscal stimulus, and later administrative guidance for energy efficiency.</w:t>
+      </w:r>
+    </w:p>
+    <w:p>
+      <w:pPr>
+        <w:jc w:val="both"/>
+      </w:pPr>
+      <w:r>
+        <w:t>Business outcomes were mixed but resilient: growth slowed to ~4–5% but maintained competitiveness through innovation. This era highlighted keiretsu strengths (risk-sharing) alongside limitations (discouraging radical exits), contributing to 1980s bubble dynamics and eventual 1990s stagnation. U.S. alliance continued as enabler, but rising global competition (e.g., China later) intensified pressures.</w:t>
+      </w:r>
+    </w:p>
+    <w:p>
+      <w:pPr>
+        <w:jc w:val="both"/>
+      </w:pPr>
+      <w:r>
+        <w:t xml:space="preserve">These points underscore how business leaders, navigating policy environments, converted challenges into advantages—relational governance and patient capital proving decisive. Less critical junctures (e.g., 1985 Plaza </w:t>
+      </w:r>
+      <w:r>
+        <w:lastRenderedPageBreak/>
+        <w:t>Accord) built on these foundations. Subsequent sections will examine firm-level actions and empirical data at these junctures. (Word count: ~890)</w:t>
+      </w:r>
+    </w:p>
+    <w:p>
+      <w:pPr>
+        <w:jc w:val="both"/>
+      </w:pPr>
+      <w:r>
+        <w:t>This paragraph seamlessly extends your opening definition. Integrate charts/tables here (e.g., GDP growth breakpoints) for visual impact. Let me know if you need expansions, references, or DOCX edits.</w:t>
+      </w:r>
+    </w:p>
+    <w:p>
+      <w:pPr>
+        <w:jc w:val="both"/>
+      </w:pPr>
+    </w:p>
+    <w:p>
+      <w:pPr>
+        <w:jc w:val="both"/>
+      </w:pPr>
+      <w:r>
+        <w:rPr>
+          <w:noProof/>
+        </w:rPr>
+        <w:drawing>
+          <wp:anchor distT="0" distB="0" distL="114300" distR="114300" simplePos="0" relativeHeight="251663360" behindDoc="1" locked="0" layoutInCell="1" allowOverlap="1" wp14:anchorId="5C93CA2D" wp14:editId="194778CA">
+            <wp:simplePos x="0" y="0"/>
+            <wp:positionH relativeFrom="column">
+              <wp:posOffset>128905</wp:posOffset>
+            </wp:positionH>
+            <wp:positionV relativeFrom="page">
+              <wp:posOffset>4621530</wp:posOffset>
+            </wp:positionV>
+            <wp:extent cx="6188710" cy="3094355"/>
+            <wp:effectExtent l="0" t="0" r="2540" b="0"/>
+            <wp:wrapNone/>
+            <wp:docPr id="2" name="Picture 2"/>
+            <wp:cNvGraphicFramePr>
+              <a:graphicFrameLocks xmlns:a="http://schemas.openxmlformats.org/drawingml/2006/main" noChangeAspect="1"/>
+            </wp:cNvGraphicFramePr>
+            <a:graphic xmlns:a="http://schemas.openxmlformats.org/drawingml/2006/main">
+              <a:graphicData uri="http://schemas.openxmlformats.org/drawingml/2006/picture">
+                <pic:pic xmlns:pic="http://schemas.openxmlformats.org/drawingml/2006/picture">
+                  <pic:nvPicPr>
+                    <pic:cNvPr id="0" name="Picture 1"/>
+                    <pic:cNvPicPr>
+                      <a:picLocks noChangeAspect="1" noChangeArrowheads="1"/>
+                    </pic:cNvPicPr>
+                  </pic:nvPicPr>
+                  <pic:blipFill>
+                    <a:blip r:embed="rId8" cstate="print">
+                      <a:extLst>
+                        <a:ext uri="{28A0092B-C50C-407E-A947-70E740481C1C}">
+                          <a14:useLocalDpi xmlns:a14="http://schemas.microsoft.com/office/drawing/2010/main" val="0"/>
+                        </a:ext>
+                      </a:extLst>
+                    </a:blip>
+                    <a:srcRect/>
+                    <a:stretch>
+                      <a:fillRect/>
+                    </a:stretch>
+                  </pic:blipFill>
+                  <pic:spPr bwMode="auto">
+                    <a:xfrm>
+                      <a:off x="0" y="0"/>
+                      <a:ext cx="6188710" cy="3094355"/>
+                    </a:xfrm>
+                    <a:prstGeom prst="rect">
+                      <a:avLst/>
+                    </a:prstGeom>
+                    <a:noFill/>
+                    <a:ln>
+                      <a:noFill/>
+                    </a:ln>
+                  </pic:spPr>
+                </pic:pic>
+              </a:graphicData>
+            </a:graphic>
+          </wp:anchor>
+        </w:drawing>
+      </w:r>
+    </w:p>
+    <w:p>
       <w:r>
         <w:br w:type="page"/>
       </w:r>
-    </w:p>
+      <w:r>
+        <w:lastRenderedPageBreak/>
+        <w:br w:type="page"/>
+      </w:r>
+      <w:r>
+        <w:rPr>
+          <w:noProof/>
+        </w:rPr>
+        <w:drawing>
+          <wp:anchor distT="0" distB="0" distL="114300" distR="114300" simplePos="0" relativeHeight="251664384" behindDoc="1" locked="0" layoutInCell="1" allowOverlap="1" wp14:anchorId="31593EEC" wp14:editId="2971E3B0">
+            <wp:simplePos x="0" y="0"/>
+            <wp:positionH relativeFrom="column">
+              <wp:posOffset>185057</wp:posOffset>
+            </wp:positionH>
+            <wp:positionV relativeFrom="page">
+              <wp:posOffset>914400</wp:posOffset>
+            </wp:positionV>
+            <wp:extent cx="6188710" cy="3072765"/>
+            <wp:effectExtent l="0" t="0" r="2540" b="0"/>
+            <wp:wrapNone/>
+            <wp:docPr id="3" name="Picture 3"/>
+            <wp:cNvGraphicFramePr>
+              <a:graphicFrameLocks xmlns:a="http://schemas.openxmlformats.org/drawingml/2006/main" noChangeAspect="1"/>
+            </wp:cNvGraphicFramePr>
+            <a:graphic xmlns:a="http://schemas.openxmlformats.org/drawingml/2006/main">
+              <a:graphicData uri="http://schemas.openxmlformats.org/drawingml/2006/picture">
+                <pic:pic xmlns:pic="http://schemas.openxmlformats.org/drawingml/2006/picture">
+                  <pic:nvPicPr>
+                    <pic:cNvPr id="0" name="Picture 2"/>
+                    <pic:cNvPicPr>
+                      <a:picLocks noChangeAspect="1" noChangeArrowheads="1"/>
+                    </pic:cNvPicPr>
+                  </pic:nvPicPr>
+                  <pic:blipFill>
+                    <a:blip r:embed="rId9" cstate="print">
+                      <a:extLst>
+                        <a:ext uri="{28A0092B-C50C-407E-A947-70E740481C1C}">
+                          <a14:useLocalDpi xmlns:a14="http://schemas.microsoft.com/office/drawing/2010/main" val="0"/>
+                        </a:ext>
+                      </a:extLst>
+                    </a:blip>
+                    <a:srcRect/>
+                    <a:stretch>
+                      <a:fillRect/>
+                    </a:stretch>
+                  </pic:blipFill>
+                  <pic:spPr bwMode="auto">
+                    <a:xfrm>
+                      <a:off x="0" y="0"/>
+                      <a:ext cx="6188710" cy="3072765"/>
+                    </a:xfrm>
+                    <a:prstGeom prst="rect">
+                      <a:avLst/>
+                    </a:prstGeom>
+                    <a:noFill/>
+                    <a:ln>
+                      <a:noFill/>
+                    </a:ln>
+                  </pic:spPr>
+                </pic:pic>
+              </a:graphicData>
+            </a:graphic>
+          </wp:anchor>
+        </w:drawing>
+      </w:r>
+    </w:p>
+    <w:p>
+      <w:r>
+        <w:rPr>
+          <w:noProof/>
+        </w:rPr>
+        <w:lastRenderedPageBreak/>
+        <w:drawing>
+          <wp:anchor distT="0" distB="0" distL="114300" distR="114300" simplePos="0" relativeHeight="251662336" behindDoc="1" locked="0" layoutInCell="1" allowOverlap="1" wp14:anchorId="72E2BAA2" wp14:editId="54D278D2">
+            <wp:simplePos x="0" y="0"/>
+            <wp:positionH relativeFrom="column">
+              <wp:posOffset>-98244</wp:posOffset>
+            </wp:positionH>
+            <wp:positionV relativeFrom="page">
+              <wp:posOffset>3987165</wp:posOffset>
+            </wp:positionV>
+            <wp:extent cx="6188710" cy="3072765"/>
+            <wp:effectExtent l="0" t="0" r="2540" b="0"/>
+            <wp:wrapNone/>
+            <wp:docPr id="4" name="Picture 4"/>
+            <wp:cNvGraphicFramePr>
+              <a:graphicFrameLocks xmlns:a="http://schemas.openxmlformats.org/drawingml/2006/main" noChangeAspect="1"/>
+            </wp:cNvGraphicFramePr>
+            <a:graphic xmlns:a="http://schemas.openxmlformats.org/drawingml/2006/main">
+              <a:graphicData uri="http://schemas.openxmlformats.org/drawingml/2006/picture">
+                <pic:pic xmlns:pic="http://schemas.openxmlformats.org/drawingml/2006/picture">
+                  <pic:nvPicPr>
+                    <pic:cNvPr id="0" name="Picture 3"/>
+                    <pic:cNvPicPr>
+                      <a:picLocks noChangeAspect="1" noChangeArrowheads="1"/>
+                    </pic:cNvPicPr>
+                  </pic:nvPicPr>
+                  <pic:blipFill>
+                    <a:blip r:embed="rId10" cstate="print">
+                      <a:extLst>
+                        <a:ext uri="{28A0092B-C50C-407E-A947-70E740481C1C}">
+                          <a14:useLocalDpi xmlns:a14="http://schemas.microsoft.com/office/drawing/2010/main" val="0"/>
+                        </a:ext>
+                      </a:extLst>
+                    </a:blip>
+                    <a:srcRect/>
+                    <a:stretch>
+                      <a:fillRect/>
+                    </a:stretch>
+                  </pic:blipFill>
+                  <pic:spPr bwMode="auto">
+                    <a:xfrm>
+                      <a:off x="0" y="0"/>
+                      <a:ext cx="6188710" cy="3072765"/>
+                    </a:xfrm>
+                    <a:prstGeom prst="rect">
+                      <a:avLst/>
+                    </a:prstGeom>
+                    <a:noFill/>
+                    <a:ln>
+                      <a:noFill/>
+                    </a:ln>
+                  </pic:spPr>
+                </pic:pic>
+              </a:graphicData>
+            </a:graphic>
+          </wp:anchor>
+        </w:drawing>
+      </w:r>
+      <w:r>
+        <w:br w:type="page"/>
+      </w:r>
+    </w:p>
+    <w:p>
+      <w:r>
+        <w:rPr>
+          <w:noProof/>
+        </w:rPr>
+        <w:lastRenderedPageBreak/>
+        <w:drawing>
+          <wp:anchor distT="0" distB="0" distL="114300" distR="114300" simplePos="0" relativeHeight="251661312" behindDoc="1" locked="0" layoutInCell="1" allowOverlap="1" wp14:anchorId="65CC8A4E" wp14:editId="352F92E9">
+            <wp:simplePos x="0" y="0"/>
+            <wp:positionH relativeFrom="column">
+              <wp:posOffset>-448783</wp:posOffset>
+            </wp:positionH>
+            <wp:positionV relativeFrom="paragraph">
+              <wp:posOffset>-527050</wp:posOffset>
+            </wp:positionV>
+            <wp:extent cx="6982921" cy="3467100"/>
+            <wp:effectExtent l="0" t="0" r="8890" b="0"/>
+            <wp:wrapNone/>
+            <wp:docPr id="5" name="Picture 5"/>
+            <wp:cNvGraphicFramePr>
+              <a:graphicFrameLocks xmlns:a="http://schemas.openxmlformats.org/drawingml/2006/main" noChangeAspect="1"/>
+            </wp:cNvGraphicFramePr>
+            <a:graphic xmlns:a="http://schemas.openxmlformats.org/drawingml/2006/main">
+              <a:graphicData uri="http://schemas.openxmlformats.org/drawingml/2006/picture">
+                <pic:pic xmlns:pic="http://schemas.openxmlformats.org/drawingml/2006/picture">
+                  <pic:nvPicPr>
+                    <pic:cNvPr id="0" name="Picture 4"/>
+                    <pic:cNvPicPr>
+                      <a:picLocks noChangeAspect="1" noChangeArrowheads="1"/>
+                    </pic:cNvPicPr>
+                  </pic:nvPicPr>
+                  <pic:blipFill>
+                    <a:blip r:embed="rId11" cstate="print">
+                      <a:extLst>
+                        <a:ext uri="{28A0092B-C50C-407E-A947-70E740481C1C}">
+                          <a14:useLocalDpi xmlns:a14="http://schemas.microsoft.com/office/drawing/2010/main" val="0"/>
+                        </a:ext>
+                      </a:extLst>
+                    </a:blip>
+                    <a:srcRect/>
+                    <a:stretch>
+                      <a:fillRect/>
+                    </a:stretch>
+                  </pic:blipFill>
+                  <pic:spPr bwMode="auto">
+                    <a:xfrm>
+                      <a:off x="0" y="0"/>
+                      <a:ext cx="7006967" cy="3479039"/>
+                    </a:xfrm>
+                    <a:prstGeom prst="rect">
+                      <a:avLst/>
+                    </a:prstGeom>
+                    <a:noFill/>
+                    <a:ln>
+                      <a:noFill/>
+                    </a:ln>
+                  </pic:spPr>
+                </pic:pic>
+              </a:graphicData>
+            </a:graphic>
+            <wp14:sizeRelH relativeFrom="margin">
+              <wp14:pctWidth>0</wp14:pctWidth>
+            </wp14:sizeRelH>
+            <wp14:sizeRelV relativeFrom="margin">
+              <wp14:pctHeight>0</wp14:pctHeight>
+            </wp14:sizeRelV>
+          </wp:anchor>
+        </w:drawing>
+      </w:r>
+      <w:r>
+        <w:br w:type="page"/>
+      </w:r>
+    </w:p>
+    <w:p>
+      <w:r>
+        <w:rPr>
+          <w:noProof/>
+        </w:rPr>
+        <w:lastRenderedPageBreak/>
+        <w:drawing>
+          <wp:anchor distT="0" distB="0" distL="114300" distR="114300" simplePos="0" relativeHeight="251660288" behindDoc="1" locked="0" layoutInCell="1" allowOverlap="1" wp14:anchorId="2DDBD6CF" wp14:editId="4AD3AA0D">
+            <wp:simplePos x="0" y="0"/>
+            <wp:positionH relativeFrom="column">
+              <wp:posOffset>-400050</wp:posOffset>
+            </wp:positionH>
+            <wp:positionV relativeFrom="page">
+              <wp:posOffset>641350</wp:posOffset>
+            </wp:positionV>
+            <wp:extent cx="6601460" cy="3300730"/>
+            <wp:effectExtent l="0" t="0" r="8890" b="0"/>
+            <wp:wrapNone/>
+            <wp:docPr id="6" name="Picture 6"/>
+            <wp:cNvGraphicFramePr>
+              <a:graphicFrameLocks xmlns:a="http://schemas.openxmlformats.org/drawingml/2006/main" noChangeAspect="1"/>
+            </wp:cNvGraphicFramePr>
+            <a:graphic xmlns:a="http://schemas.openxmlformats.org/drawingml/2006/main">
+              <a:graphicData uri="http://schemas.openxmlformats.org/drawingml/2006/picture">
+                <pic:pic xmlns:pic="http://schemas.openxmlformats.org/drawingml/2006/picture">
+                  <pic:nvPicPr>
+                    <pic:cNvPr id="0" name="Picture 5"/>
+                    <pic:cNvPicPr>
+                      <a:picLocks noChangeAspect="1" noChangeArrowheads="1"/>
+                    </pic:cNvPicPr>
+                  </pic:nvPicPr>
+                  <pic:blipFill>
+                    <a:blip r:embed="rId12" cstate="print">
+                      <a:extLst>
+                        <a:ext uri="{28A0092B-C50C-407E-A947-70E740481C1C}">
+                          <a14:useLocalDpi xmlns:a14="http://schemas.microsoft.com/office/drawing/2010/main" val="0"/>
+                        </a:ext>
+                      </a:extLst>
+                    </a:blip>
+                    <a:srcRect/>
+                    <a:stretch>
+                      <a:fillRect/>
+                    </a:stretch>
+                  </pic:blipFill>
+                  <pic:spPr bwMode="auto">
+                    <a:xfrm>
+                      <a:off x="0" y="0"/>
+                      <a:ext cx="6601460" cy="3300730"/>
+                    </a:xfrm>
+                    <a:prstGeom prst="rect">
+                      <a:avLst/>
+                    </a:prstGeom>
+                    <a:noFill/>
+                    <a:ln>
+                      <a:noFill/>
+                    </a:ln>
+                  </pic:spPr>
+                </pic:pic>
+              </a:graphicData>
+            </a:graphic>
+            <wp14:sizeRelH relativeFrom="margin">
+              <wp14:pctWidth>0</wp14:pctWidth>
+            </wp14:sizeRelH>
+            <wp14:sizeRelV relativeFrom="margin">
+              <wp14:pctHeight>0</wp14:pctHeight>
+            </wp14:sizeRelV>
+          </wp:anchor>
+        </w:drawing>
+      </w:r>
+      <w:r>
+        <w:br w:type="page"/>
+      </w:r>
+    </w:p>
+    <w:p/>
     <w:p/>
     <w:p/>
     <w:tbl>
@@ -1430,9 +2470,11 @@
             </w:pPr>
             <w:r>
               <w:rPr>
+                <w:rFonts w:hint="cs"/>
                 <w:iCs/>
-              </w:rPr>
-              <w:t>30</w:t>
+                <w:rtl/>
+              </w:rPr>
+              <w:t>0</w:t>
             </w:r>
           </w:p>
         </w:tc>
@@ -2030,9 +3072,11 @@
             </w:pPr>
             <w:r>
               <w:rPr>
+                <w:rFonts w:hint="cs"/>
                 <w:iCs/>
-              </w:rPr>
-              <w:t>50</w:t>
+                <w:rtl/>
+              </w:rPr>
+              <w:t>0</w:t>
             </w:r>
           </w:p>
         </w:tc>
@@ -2306,8 +3350,35 @@
       </w:r>
     </w:p>
     <w:p>
-      <w:r>
+      <w:pPr>
+        <w:rPr>
+          <w:strike/>
+        </w:rPr>
+      </w:pPr>
+      <w:r>
+        <w:rPr>
+          <w:strike/>
+        </w:rPr>
         <w:t>4</w:t>
+      </w:r>
+      <w:r>
+        <w:rPr>
+          <w:rFonts w:cs="Arial"/>
+          <w:strike/>
+          <w:rtl/>
+        </w:rPr>
+        <w:t xml:space="preserve">- </w:t>
+      </w:r>
+      <w:r>
+        <w:rPr>
+          <w:strike/>
+        </w:rPr>
+        <w:t>get the data to work with</w:t>
+      </w:r>
+    </w:p>
+    <w:p>
+      <w:r>
+        <w:t>5</w:t>
       </w:r>
       <w:r>
         <w:rPr>
@@ -2317,12 +3388,12 @@
         <w:t xml:space="preserve">- </w:t>
       </w:r>
       <w:r>
-        <w:t>get the data to work with</w:t>
-      </w:r>
-    </w:p>
-    <w:p>
-      <w:r>
-        <w:t>5</w:t>
+        <w:t>add the body of the project (which we will talk about later)</w:t>
+      </w:r>
+    </w:p>
+    <w:p>
+      <w:r>
+        <w:t>6</w:t>
       </w:r>
       <w:r>
         <w:rPr>
@@ -2332,12 +3403,12 @@
         <w:t xml:space="preserve">- </w:t>
       </w:r>
       <w:r>
-        <w:t>add the body of the project (which we will talk about later)</w:t>
-      </w:r>
-    </w:p>
-    <w:p>
-      <w:r>
-        <w:t>6</w:t>
+        <w:t>have the conclusion</w:t>
+      </w:r>
+    </w:p>
+    <w:p>
+      <w:r>
+        <w:t>7</w:t>
       </w:r>
       <w:r>
         <w:rPr>
@@ -2347,12 +3418,12 @@
         <w:t xml:space="preserve">- </w:t>
       </w:r>
       <w:r>
-        <w:t>have the conclusion</w:t>
-      </w:r>
-    </w:p>
-    <w:p>
-      <w:r>
-        <w:t>7</w:t>
+        <w:t>write the introduction</w:t>
+      </w:r>
+    </w:p>
+    <w:p>
+      <w:r>
+        <w:t>8</w:t>
       </w:r>
       <w:r>
         <w:rPr>
@@ -2362,12 +3433,12 @@
         <w:t xml:space="preserve">- </w:t>
       </w:r>
       <w:r>
-        <w:t>write the introduction</w:t>
-      </w:r>
-    </w:p>
-    <w:p>
-      <w:r>
-        <w:t>8</w:t>
+        <w:t>write the abstract</w:t>
+      </w:r>
+    </w:p>
+    <w:p>
+      <w:r>
+        <w:t>9</w:t>
       </w:r>
       <w:r>
         <w:rPr>
@@ -2377,21 +3448,6 @@
         <w:t xml:space="preserve">- </w:t>
       </w:r>
       <w:r>
-        <w:t>write the abstract</w:t>
-      </w:r>
-    </w:p>
-    <w:p>
-      <w:r>
-        <w:t>9</w:t>
-      </w:r>
-      <w:r>
-        <w:rPr>
-          <w:rFonts w:cs="Arial"/>
-          <w:rtl/>
-        </w:rPr>
-        <w:t xml:space="preserve">- </w:t>
-      </w:r>
-      <w:r>
         <w:t>have the bibliography attached to the end of the file</w:t>
       </w:r>
     </w:p>
@@ -2416,12 +3472,12 @@
         <w:pStyle w:val="Title2"/>
         <w:ind w:left="0"/>
       </w:pPr>
-      <w:bookmarkStart w:id="3" w:name="_Toc234763683"/>
+      <w:bookmarkStart w:id="4" w:name="_Toc234854330"/>
       <w:r>
         <w:lastRenderedPageBreak/>
         <w:t>References</w:t>
       </w:r>
-      <w:bookmarkEnd w:id="3"/>
+      <w:bookmarkEnd w:id="4"/>
     </w:p>
     <w:p>
       <w:pPr>
@@ -2687,7 +3743,7 @@
       </w:sdtContent>
     </w:sdt>
     <w:sectPr>
-      <w:footerReference w:type="default" r:id="rId8"/>
+      <w:footerReference w:type="default" r:id="rId13"/>
       <w:pgSz w:w="11906" w:h="16838" w:code="9"/>
       <w:pgMar w:top="1440" w:right="1080" w:bottom="1440" w:left="1080" w:header="576" w:footer="576" w:gutter="0"/>
       <w:cols w:space="720"/>
@@ -4191,8 +5247,8 @@
   </w:compat>
   <w:rsids>
     <w:rsidRoot w:val="003A7952"/>
-    <w:rsid w:val="000E75C2"/>
     <w:rsid w:val="003A7952"/>
+    <w:rsid w:val="00465592"/>
     <w:rsid w:val="005E2486"/>
   </w:rsids>
   <m:mathPr>
@@ -4988,7 +6044,7 @@
   <we:properties>
     <we:property name="MENDELEY_BIBLIOGRAPHY_IS_DIRTY" value="true"/>
     <we:property name="MENDELEY_BIBLIOGRAPHY_LAST_MODIFIED" value="1783847829193"/>
-    <we:property name="MENDELEY_CITATIONS" value="[]"/>
+    <we:property name="MENDELEY_CITATIONS" value="[{&quot;citationID&quot;:&quot;MENDELEY_CITATION_dc96fa10-71f1-4baf-bbbe-e69ced2d911d&quot;,&quot;properties&quot;:{&quot;noteIndex&quot;:0},&quot;isEdited&quot;:false,&quot;manualOverride&quot;:{&quot;isManuallyOverridden&quot;:false,&quot;citeprocText&quot;:&quot;(Takada, 1999)&quot;,&quot;manualOverrideText&quot;:&quot;&quot;},&quot;citationTag&quot;:&quot;MENDELEY_CITATION_v3_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&quot;,&quot;citationItems&quot;:[{&quot;id&quot;:&quot;9bfbe78e-55ba-3d43-9cfa-42308fc1b8ec&quot;,&quot;itemData&quot;:{&quot;type&quot;:&quot;article-journal&quot;,&quot;id&quot;:&quot;9bfbe78e-55ba-3d43-9cfa-42308fc1b8ec&quot;,&quot;title&quot;:&quot;Japan's Economic Miracle: Underlying Factors and Strategies for the Growth.&quot;,&quot;author&quot;:[{&quot;family&quot;:&quot;Takada&quot;,&quot;given&quot;:&quot;Masahiro&quot;,&quot;parse-names&quot;:false,&quot;dropping-particle&quot;:&quot;&quot;,&quot;non-dropping-particle&quot;:&quot;&quot;}],&quot;issued&quot;:{&quot;date-parts&quot;:[[1999]]},&quot;container-title-short&quot;:&quot;&quot;},&quot;isTemporary&quot;:false}]},{&quot;citationID&quot;:&quot;MENDELEY_CITATION_9873a62a-982e-4ccb-981c-e6ac3feeeaaa&quot;,&quot;properties&quot;:{&quot;noteIndex&quot;:0},&quot;isEdited&quot;:false,&quot;manualOverride&quot;:{&quot;isManuallyOverridden&quot;:false,&quot;citeprocText&quot;:&quot;(Takada, 1999)&quot;,&quot;manualOverrideText&quot;:&quot;&quot;},&quot;citationTag&quot;:&quot;MENDELEY_CITATION_v3_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&quot;,&quot;citationItems&quot;:[{&quot;id&quot;:&quot;9bfbe78e-55ba-3d43-9cfa-42308fc1b8ec&quot;,&quot;itemData&quot;:{&quot;type&quot;:&quot;article-journal&quot;,&quot;id&quot;:&quot;9bfbe78e-55ba-3d43-9cfa-42308fc1b8ec&quot;,&quot;title&quot;:&quot;Japan's Economic Miracle: Underlying Factors and Strategies for the Growth.&quot;,&quot;author&quot;:[{&quot;family&quot;:&quot;Takada&quot;,&quot;given&quot;:&quot;Masahiro&quot;,&quot;parse-names&quot;:false,&quot;dropping-particle&quot;:&quot;&quot;,&quot;non-dropping-particle&quot;:&quot;&quot;}],&quot;issued&quot;:{&quot;date-parts&quot;:[[1999]]},&quot;container-title-short&quot;:&quot;&quot;},&quot;isTemporary&quot;:false}]}]"/>
     <we:property name="MENDELEY_CITATIONS_STYLE" value="{&quot;id&quot;:&quot;https://www.zotero.org/styles/apa&quot;,&quot;title&quot;:&quot;APA Style 7th edition&quot;,&quot;format&quot;:&quot;author-date&quot;,&quot;defaultLocale&quot;:null,&quot;isLocaleCodeValid&quot;:true}"/>
   </we:properties>
   <we:bindings/>

</xml_diff>